<commit_message>
Fase 2: SEC-01 v1.1 y MOC-01 v1.1; corrige carpeta de analisis y diseno duplicada
</commit_message>
<xml_diff>
--- a/Fase 2/Evidencias Proyecto/Evidencias de documentación/3. Análisis y diseño/SITRAFO_ARQ-01_Arquitectura_y_Diseno.docx
+++ b/Fase 2/Evidencias Proyecto/Evidencias de documentación/3. Análisis y diseño/SITRAFO_ARQ-01_Arquitectura_y_Diseno.docx
@@ -94,7 +94,7 @@
           <w:sz w:val="26"/>
           <w:szCs w:val="26"/>
         </w:rPr>
-        <w:t xml:space="preserve">ARQ-01  ·  Versión 1.0</w:t>
+        <w:t xml:space="preserve">ARQ-01  ·  Versión 1.1</w:t>
       </w:r>
     </w:p>
     <w:tbl>
@@ -866,7 +866,7 @@
                 <w:sz w:val="20"/>
                 <w:szCs w:val="20"/>
               </w:rPr>
-              <w:t xml:space="preserve">8 de octubre de 2026</w:t>
+              <w:t xml:space="preserve">10 de octubre de 2026</w:t>
             </w:r>
           </w:p>
         </w:tc>
@@ -1652,7 +1652,7 @@
                 <w:sz w:val="18"/>
                 <w:szCs w:val="18"/>
               </w:rPr>
-              <w:t xml:space="preserve">Vistas DRF (29 recursos bajo /api/v1/), vistas web, middleware</w:t>
+              <w:t xml:space="preserve">Vistas DRF (29 recursos bajo /api/v1/, más las rutas de autenticación, reportes y pendientes), vistas web, middleware</w:t>
             </w:r>
           </w:p>
         </w:tc>
@@ -1836,7 +1836,7 @@
                 <w:sz w:val="18"/>
                 <w:szCs w:val="18"/>
               </w:rPr>
-              <w:t xml:space="preserve">Módulos services de cada aplicación, reportes, notificaciones</w:t>
+              <w:t xml:space="preserve">Módulos services de cada aplicación, reportes, notificaciones y bandeja de pendientes</w:t>
             </w:r>
           </w:p>
         </w:tc>
@@ -2962,7 +2962,7 @@
       <w:r>
         <w:drawing>
           <wp:inline distT="0" distB="0" distL="0" distR="0">
-            <wp:extent cx="7296150" cy="5391150"/>
+            <wp:extent cx="8039100" cy="5391150"/>
             <wp:effectExtent t="0" r="0" b="0" l="0"/>
             <wp:docPr id="1" name="Figura 1. Diagrama de componentes de SITRAFO." descr="Figura 1. Diagrama de componentes de SITRAFO." title="Figura 1. Diagrama de componentes de SITRAFO."/>
             <wp:cNvGraphicFramePr>
@@ -2987,7 +2987,7 @@
                   <pic:spPr bwMode="auto">
                     <a:xfrm>
                       <a:off x="0" y="0"/>
-                      <a:ext cx="7296150" cy="5391150"/>
+                      <a:ext cx="8039100" cy="5391150"/>
                     </a:xfrm>
                     <a:prstGeom prst="rect">
                       <a:avLst/>
@@ -6227,7 +6227,7 @@
                 <w:sz w:val="18"/>
                 <w:szCs w:val="18"/>
               </w:rPr>
-              <w:t xml:space="preserve">Correos transaccionales: acuse, cotización con PDF, comprobantes y avisos.</w:t>
+              <w:t xml:space="preserve">Correos transaccionales al cliente (acuse, cotización con PDF, comprobantes, hitos del pedido) y avisos internos cuando el trabajo pasa de un rol a otro.</w:t>
             </w:r>
           </w:p>
         </w:tc>
@@ -6256,7 +6256,7 @@
                 <w:sz w:val="18"/>
                 <w:szCs w:val="18"/>
               </w:rPr>
-              <w:t xml:space="preserve">La operación de negocio se registra igual y el escritorio permite reenviar.</w:t>
+              <w:t xml:space="preserve">La operación de negocio se registra igual y el escritorio permite reenviar la cotización; los pendientes siguen visibles en la bandeja de cada rol.</w:t>
             </w:r>
           </w:p>
         </w:tc>
@@ -6297,7 +6297,7 @@
         <w:jc w:val="both"/>
       </w:pPr>
       <w:r>
-        <w:t xml:space="preserve">Los documentos del flujo cambian de estado mediante acciones explícitas; ningún estado se edita directamente. Los estados de solicitud, cotización, orden de compra y orden de trabajo están parametrizados en la tabla estado_documento (21 estados) y cada transición registra una fila en la tabla de historial del documento (RN-14). En los diagramas, el texto entre corchetes es la condición de la transición y el texto tras la barra, la acción que la acompaña.</w:t>
+        <w:t xml:space="preserve">Los documentos del flujo cambian de estado mediante acciones explícitas; ningún estado se edita directamente. Los estados de solicitud, cotización, orden de compra y orden de trabajo están parametrizados en la tabla estado_documento (22 estados) y cada transición registra una fila en la tabla de historial del documento (RN-14). En los diagramas, el texto entre corchetes es la condición de la transición y el texto tras la barra, la acción que la acompaña.</w:t>
       </w:r>
     </w:p>
     <w:p>
@@ -6626,7 +6626,7 @@
         <w:jc w:val="both"/>
       </w:pPr>
       <w:r>
-        <w:t xml:space="preserve">El cierre verifica en el servidor las condiciones de calidad (RN-12) y la justificación de la desviación de costo (RN-11).</w:t>
+        <w:t xml:space="preserve">La orden no se cierra directamente desde calidad: el inspector aprueba el control y la orden queda Liberada por calidad; sólo entonces el jefe de producción puede cerrarla. El servidor vuelve a verificar las condiciones de calidad (RN-12) y la justificación de la desviación de costo (RN-11). Cada paso avisa por correo al rol siguiente y aparece en su bandeja de pendientes.</w:t>
       </w:r>
     </w:p>
     <w:p>
@@ -6650,7 +6650,7 @@
       <w:r>
         <w:drawing>
           <wp:inline distT="0" distB="0" distL="0" distR="0">
-            <wp:extent cx="5943600" cy="7143750"/>
+            <wp:extent cx="5314950" cy="7496175"/>
             <wp:effectExtent t="0" r="0" b="0" l="0"/>
             <wp:docPr id="1" name="Figura 6. Estados de la orden de trabajo." descr="Figura 6. Estados de la orden de trabajo." title="Figura 6. Estados de la orden de trabajo."/>
             <wp:cNvGraphicFramePr>
@@ -6675,7 +6675,7 @@
                   <pic:spPr bwMode="auto">
                     <a:xfrm>
                       <a:off x="0" y="0"/>
-                      <a:ext cx="5943600" cy="7143750"/>
+                      <a:ext cx="5314950" cy="7496175"/>
                     </a:xfrm>
                     <a:prstGeom prst="rect">
                       <a:avLst/>
@@ -6938,7 +6938,7 @@
         <w:jc w:val="both"/>
       </w:pPr>
       <w:r>
-        <w:t xml:space="preserve">El diagrama ACT-01 recorre el proceso completo, desde la solicitud del cliente hasta la entrega, con un carril por actor. El carril «Sistema» agrupa las acciones que el sistema ejecuta automáticamente, sin intervención de usuarios: congelamiento de la UF, generación de la orden de compra y del anticipo, conciliación de pagos, confirmación de la orden, descuento de stock, recálculo de costos y emisión del saldo.</w:t>
+        <w:t xml:space="preserve">El diagrama ACT-01 recorre el proceso completo, desde la solicitud del cliente hasta la entrega, con un carril por actor. El carril «Sistema» agrupa las acciones que el sistema ejecuta automáticamente, sin intervención de usuarios: congelamiento de la UF, generación de la orden de compra y del anticipo, conciliación de pagos, confirmación de la orden, descuento de stock, recálculo de costos, avisos al rol siguiente y emisión del saldo. La OT pasa a producción para su cierre sólo cuando el inspector aprueba el control.</w:t>
       </w:r>
     </w:p>
     <w:p>
@@ -6971,7 +6971,7 @@
       <w:r>
         <w:drawing>
           <wp:inline distT="0" distB="0" distL="0" distR="0">
-            <wp:extent cx="5943600" cy="6219825"/>
+            <wp:extent cx="5943600" cy="6610350"/>
             <wp:effectExtent t="0" r="0" b="0" l="0"/>
             <wp:docPr id="1" name="Figura 9. Diagrama de actividad del proceso de un pedido." descr="Figura 9. Diagrama de actividad del proceso de un pedido." title="Figura 9. Diagrama de actividad del proceso de un pedido."/>
             <wp:cNvGraphicFramePr>
@@ -6996,7 +6996,7 @@
                   <pic:spPr bwMode="auto">
                     <a:xfrm>
                       <a:off x="0" y="0"/>
-                      <a:ext cx="5943600" cy="6219825"/>
+                      <a:ext cx="5943600" cy="6610350"/>
                     </a:xfrm>
                     <a:prstGeom prst="rect">
                       <a:avLst/>
@@ -8444,6 +8444,127 @@
                 <w:szCs w:val="20"/>
               </w:rPr>
               <w:t xml:space="preserve">Versión inicial, elaborada a partir del sistema implementado y desplegado en la Fase 2.</w:t>
+            </w:r>
+          </w:p>
+        </w:tc>
+      </w:tr>
+      <w:tr>
+        <w:trPr>
+          <w:cantSplit/>
+        </w:trPr>
+        <w:tc>
+          <w:tcPr>
+            <w:tcW w:type="dxa" w:w="1000"/>
+            <w:tcBorders>
+              <w:top w:val="single" w:color="8496B0" w:sz="4"/>
+              <w:left w:val="single" w:color="8496B0" w:sz="4"/>
+              <w:bottom w:val="single" w:color="8496B0" w:sz="4"/>
+              <w:right w:val="single" w:color="8496B0" w:sz="4"/>
+            </w:tcBorders>
+            <w:tcMar>
+              <w:top w:type="dxa" w:w="50"/>
+              <w:left w:type="dxa" w:w="90"/>
+              <w:bottom w:type="dxa" w:w="50"/>
+              <w:right w:type="dxa" w:w="90"/>
+            </w:tcMar>
+          </w:tcPr>
+          <w:p>
+            <w:r>
+              <w:rPr>
+                <w:rFonts w:ascii="Calibri" w:cs="Calibri" w:eastAsia="Calibri" w:hAnsi="Calibri"/>
+                <w:b w:val="false"/>
+                <w:bCs w:val="false"/>
+                <w:sz w:val="20"/>
+                <w:szCs w:val="20"/>
+              </w:rPr>
+              <w:t xml:space="preserve">1.1</w:t>
+            </w:r>
+          </w:p>
+        </w:tc>
+        <w:tc>
+          <w:tcPr>
+            <w:tcW w:type="dxa" w:w="1500"/>
+            <w:tcBorders>
+              <w:top w:val="single" w:color="8496B0" w:sz="4"/>
+              <w:left w:val="single" w:color="8496B0" w:sz="4"/>
+              <w:bottom w:val="single" w:color="8496B0" w:sz="4"/>
+              <w:right w:val="single" w:color="8496B0" w:sz="4"/>
+            </w:tcBorders>
+            <w:tcMar>
+              <w:top w:type="dxa" w:w="50"/>
+              <w:left w:type="dxa" w:w="90"/>
+              <w:bottom w:type="dxa" w:w="50"/>
+              <w:right w:type="dxa" w:w="90"/>
+            </w:tcMar>
+          </w:tcPr>
+          <w:p>
+            <w:r>
+              <w:rPr>
+                <w:rFonts w:ascii="Calibri" w:cs="Calibri" w:eastAsia="Calibri" w:hAnsi="Calibri"/>
+                <w:b w:val="false"/>
+                <w:bCs w:val="false"/>
+                <w:sz w:val="20"/>
+                <w:szCs w:val="20"/>
+              </w:rPr>
+              <w:t xml:space="preserve">10-10-2026</w:t>
+            </w:r>
+          </w:p>
+        </w:tc>
+        <w:tc>
+          <w:tcPr>
+            <w:tcW w:type="dxa" w:w="2300"/>
+            <w:tcBorders>
+              <w:top w:val="single" w:color="8496B0" w:sz="4"/>
+              <w:left w:val="single" w:color="8496B0" w:sz="4"/>
+              <w:bottom w:val="single" w:color="8496B0" w:sz="4"/>
+              <w:right w:val="single" w:color="8496B0" w:sz="4"/>
+            </w:tcBorders>
+            <w:tcMar>
+              <w:top w:type="dxa" w:w="50"/>
+              <w:left w:type="dxa" w:w="90"/>
+              <w:bottom w:type="dxa" w:w="50"/>
+              <w:right w:type="dxa" w:w="90"/>
+            </w:tcMar>
+          </w:tcPr>
+          <w:p>
+            <w:r>
+              <w:rPr>
+                <w:rFonts w:ascii="Calibri" w:cs="Calibri" w:eastAsia="Calibri" w:hAnsi="Calibri"/>
+                <w:b w:val="false"/>
+                <w:bCs w:val="false"/>
+                <w:sz w:val="20"/>
+                <w:szCs w:val="20"/>
+              </w:rPr>
+              <w:t xml:space="preserve">Benjamín Delgado Bravo</w:t>
+            </w:r>
+          </w:p>
+        </w:tc>
+        <w:tc>
+          <w:tcPr>
+            <w:tcW w:type="dxa" w:w="4560"/>
+            <w:tcBorders>
+              <w:top w:val="single" w:color="8496B0" w:sz="4"/>
+              <w:left w:val="single" w:color="8496B0" w:sz="4"/>
+              <w:bottom w:val="single" w:color="8496B0" w:sz="4"/>
+              <w:right w:val="single" w:color="8496B0" w:sz="4"/>
+            </w:tcBorders>
+            <w:tcMar>
+              <w:top w:type="dxa" w:w="50"/>
+              <w:left w:type="dxa" w:w="90"/>
+              <w:bottom w:type="dxa" w:w="50"/>
+              <w:right w:type="dxa" w:w="90"/>
+            </w:tcMar>
+          </w:tcPr>
+          <w:p>
+            <w:r>
+              <w:rPr>
+                <w:rFonts w:ascii="Calibri" w:cs="Calibri" w:eastAsia="Calibri" w:hAnsi="Calibri"/>
+                <w:b w:val="false"/>
+                <w:bCs w:val="false"/>
+                <w:sz w:val="20"/>
+                <w:szCs w:val="20"/>
+              </w:rPr>
+              <w:t xml:space="preserve">Estado «Liberada por calidad» de la orden de trabajo (22 estados), aprobación del control en el diagrama de actividad, bandeja de pendientes y avisos por correo entre roles.</w:t>
             </w:r>
           </w:p>
         </w:tc>
@@ -9071,7 +9192,7 @@
         <w:sz w:val="16"/>
         <w:szCs w:val="16"/>
       </w:rPr>
-      <w:t xml:space="preserve">SITRAFO · ARQ-01 Arquitectura y Diseño del Comportamiento · v1.0</w:t>
+      <w:t xml:space="preserve">SITRAFO · ARQ-01 Arquitectura y Diseño del Comportamiento · v1.1</w:t>
     </w:r>
   </w:p>
 </w:hdr>
@@ -9091,7 +9212,7 @@
         <w:sz w:val="16"/>
         <w:szCs w:val="16"/>
       </w:rPr>
-      <w:t xml:space="preserve">SITRAFO · ARQ-01 Arquitectura y Diseño del Comportamiento · v1.0</w:t>
+      <w:t xml:space="preserve">SITRAFO · ARQ-01 Arquitectura y Diseño del Comportamiento · v1.1</w:t>
     </w:r>
   </w:p>
 </w:hdr>
@@ -9111,7 +9232,7 @@
         <w:sz w:val="16"/>
         <w:szCs w:val="16"/>
       </w:rPr>
-      <w:t xml:space="preserve">SITRAFO · ARQ-01 Arquitectura y Diseño del Comportamiento · v1.0</w:t>
+      <w:t xml:space="preserve">SITRAFO · ARQ-01 Arquitectura y Diseño del Comportamiento · v1.1</w:t>
     </w:r>
   </w:p>
 </w:hdr>
@@ -9131,7 +9252,7 @@
         <w:sz w:val="16"/>
         <w:szCs w:val="16"/>
       </w:rPr>
-      <w:t xml:space="preserve">SITRAFO · ARQ-01 Arquitectura y Diseño del Comportamiento · v1.0</w:t>
+      <w:t xml:space="preserve">SITRAFO · ARQ-01 Arquitectura y Diseño del Comportamiento · v1.1</w:t>
     </w:r>
   </w:p>
 </w:hdr>
@@ -9151,7 +9272,7 @@
         <w:sz w:val="16"/>
         <w:szCs w:val="16"/>
       </w:rPr>
-      <w:t xml:space="preserve">SITRAFO · ARQ-01 Arquitectura y Diseño del Comportamiento · v1.0</w:t>
+      <w:t xml:space="preserve">SITRAFO · ARQ-01 Arquitectura y Diseño del Comportamiento · v1.1</w:t>
     </w:r>
   </w:p>
 </w:hdr>
@@ -9171,7 +9292,7 @@
         <w:sz w:val="16"/>
         <w:szCs w:val="16"/>
       </w:rPr>
-      <w:t xml:space="preserve">SITRAFO · ARQ-01 Arquitectura y Diseño del Comportamiento · v1.0</w:t>
+      <w:t xml:space="preserve">SITRAFO · ARQ-01 Arquitectura y Diseño del Comportamiento · v1.1</w:t>
     </w:r>
   </w:p>
 </w:hdr>
@@ -9191,7 +9312,7 @@
         <w:sz w:val="16"/>
         <w:szCs w:val="16"/>
       </w:rPr>
-      <w:t xml:space="preserve">SITRAFO · ARQ-01 Arquitectura y Diseño del Comportamiento · v1.0</w:t>
+      <w:t xml:space="preserve">SITRAFO · ARQ-01 Arquitectura y Diseño del Comportamiento · v1.1</w:t>
     </w:r>
   </w:p>
 </w:hdr>
@@ -9211,7 +9332,7 @@
         <w:sz w:val="16"/>
         <w:szCs w:val="16"/>
       </w:rPr>
-      <w:t xml:space="preserve">SITRAFO · ARQ-01 Arquitectura y Diseño del Comportamiento · v1.0</w:t>
+      <w:t xml:space="preserve">SITRAFO · ARQ-01 Arquitectura y Diseño del Comportamiento · v1.1</w:t>
     </w:r>
   </w:p>
 </w:hdr>
@@ -9231,7 +9352,7 @@
         <w:sz w:val="16"/>
         <w:szCs w:val="16"/>
       </w:rPr>
-      <w:t xml:space="preserve">SITRAFO · ARQ-01 Arquitectura y Diseño del Comportamiento · v1.0</w:t>
+      <w:t xml:space="preserve">SITRAFO · ARQ-01 Arquitectura y Diseño del Comportamiento · v1.1</w:t>
     </w:r>
   </w:p>
 </w:hdr>
@@ -9251,7 +9372,7 @@
         <w:sz w:val="16"/>
         <w:szCs w:val="16"/>
       </w:rPr>
-      <w:t xml:space="preserve">SITRAFO · ARQ-01 Arquitectura y Diseño del Comportamiento · v1.0</w:t>
+      <w:t xml:space="preserve">SITRAFO · ARQ-01 Arquitectura y Diseño del Comportamiento · v1.1</w:t>
     </w:r>
   </w:p>
 </w:hdr>
@@ -9271,7 +9392,7 @@
         <w:sz w:val="16"/>
         <w:szCs w:val="16"/>
       </w:rPr>
-      <w:t xml:space="preserve">SITRAFO · ARQ-01 Arquitectura y Diseño del Comportamiento · v1.0</w:t>
+      <w:t xml:space="preserve">SITRAFO · ARQ-01 Arquitectura y Diseño del Comportamiento · v1.1</w:t>
     </w:r>
   </w:p>
 </w:hdr>
@@ -9291,7 +9412,7 @@
         <w:sz w:val="16"/>
         <w:szCs w:val="16"/>
       </w:rPr>
-      <w:t xml:space="preserve">SITRAFO · ARQ-01 Arquitectura y Diseño del Comportamiento · v1.0</w:t>
+      <w:t xml:space="preserve">SITRAFO · ARQ-01 Arquitectura y Diseño del Comportamiento · v1.1</w:t>
     </w:r>
   </w:p>
 </w:hdr>
@@ -9311,7 +9432,7 @@
         <w:sz w:val="16"/>
         <w:szCs w:val="16"/>
       </w:rPr>
-      <w:t xml:space="preserve">SITRAFO · ARQ-01 Arquitectura y Diseño del Comportamiento · v1.0</w:t>
+      <w:t xml:space="preserve">SITRAFO · ARQ-01 Arquitectura y Diseño del Comportamiento · v1.1</w:t>
     </w:r>
   </w:p>
 </w:hdr>
@@ -9331,7 +9452,7 @@
         <w:sz w:val="16"/>
         <w:szCs w:val="16"/>
       </w:rPr>
-      <w:t xml:space="preserve">SITRAFO · ARQ-01 Arquitectura y Diseño del Comportamiento · v1.0</w:t>
+      <w:t xml:space="preserve">SITRAFO · ARQ-01 Arquitectura y Diseño del Comportamiento · v1.1</w:t>
     </w:r>
   </w:p>
 </w:hdr>
@@ -9351,7 +9472,7 @@
         <w:sz w:val="16"/>
         <w:szCs w:val="16"/>
       </w:rPr>
-      <w:t xml:space="preserve">SITRAFO · ARQ-01 Arquitectura y Diseño del Comportamiento · v1.0</w:t>
+      <w:t xml:space="preserve">SITRAFO · ARQ-01 Arquitectura y Diseño del Comportamiento · v1.1</w:t>
     </w:r>
   </w:p>
 </w:hdr>
@@ -9371,7 +9492,7 @@
         <w:sz w:val="16"/>
         <w:szCs w:val="16"/>
       </w:rPr>
-      <w:t xml:space="preserve">SITRAFO · ARQ-01 Arquitectura y Diseño del Comportamiento · v1.0</w:t>
+      <w:t xml:space="preserve">SITRAFO · ARQ-01 Arquitectura y Diseño del Comportamiento · v1.1</w:t>
     </w:r>
   </w:p>
 </w:hdr>
@@ -9391,7 +9512,7 @@
         <w:sz w:val="16"/>
         <w:szCs w:val="16"/>
       </w:rPr>
-      <w:t xml:space="preserve">SITRAFO · ARQ-01 Arquitectura y Diseño del Comportamiento · v1.0</w:t>
+      <w:t xml:space="preserve">SITRAFO · ARQ-01 Arquitectura y Diseño del Comportamiento · v1.1</w:t>
     </w:r>
   </w:p>
 </w:hdr>
@@ -9411,7 +9532,7 @@
         <w:sz w:val="16"/>
         <w:szCs w:val="16"/>
       </w:rPr>
-      <w:t xml:space="preserve">SITRAFO · ARQ-01 Arquitectura y Diseño del Comportamiento · v1.0</w:t>
+      <w:t xml:space="preserve">SITRAFO · ARQ-01 Arquitectura y Diseño del Comportamiento · v1.1</w:t>
     </w:r>
   </w:p>
 </w:hdr>
@@ -9431,7 +9552,7 @@
         <w:sz w:val="16"/>
         <w:szCs w:val="16"/>
       </w:rPr>
-      <w:t xml:space="preserve">SITRAFO · ARQ-01 Arquitectura y Diseño del Comportamiento · v1.0</w:t>
+      <w:t xml:space="preserve">SITRAFO · ARQ-01 Arquitectura y Diseño del Comportamiento · v1.1</w:t>
     </w:r>
   </w:p>
 </w:hdr>

</xml_diff>

<commit_message>
Docs: ARQ-01 v1.2, MOC-01 v1.2 y MAN-01 con las APIs propias (RF-INT-04, RF-OT-12, RF-COM-18)
</commit_message>
<xml_diff>
--- a/Fase 2/Evidencias Proyecto/Evidencias de documentación/3. Análisis y diseño/SITRAFO_ARQ-01_Arquitectura_y_Diseno.docx
+++ b/Fase 2/Evidencias Proyecto/Evidencias de documentación/3. Análisis y diseño/SITRAFO_ARQ-01_Arquitectura_y_Diseno.docx
@@ -94,7 +94,7 @@
           <w:sz w:val="26"/>
           <w:szCs w:val="26"/>
         </w:rPr>
-        <w:t xml:space="preserve">ARQ-01  ·  Versión 1.1</w:t>
+        <w:t xml:space="preserve">ARQ-01  ·  Versión 1.2</w:t>
       </w:r>
     </w:p>
     <w:tbl>
@@ -866,7 +866,7 @@
                 <w:sz w:val="20"/>
                 <w:szCs w:val="20"/>
               </w:rPr>
-              <w:t xml:space="preserve">10 de octubre de 2026</w:t>
+              <w:t xml:space="preserve">19 de octubre de 2026</w:t>
             </w:r>
           </w:p>
         </w:tc>
@@ -1459,6 +1459,127 @@
           </w:p>
         </w:tc>
       </w:tr>
+      <w:tr>
+        <w:trPr>
+          <w:cantSplit/>
+        </w:trPr>
+        <w:tc>
+          <w:tcPr>
+            <w:tcW w:type="dxa" w:w="2000"/>
+            <w:tcBorders>
+              <w:top w:val="single" w:color="8496B0" w:sz="4"/>
+              <w:left w:val="single" w:color="8496B0" w:sz="4"/>
+              <w:bottom w:val="single" w:color="8496B0" w:sz="4"/>
+              <w:right w:val="single" w:color="8496B0" w:sz="4"/>
+            </w:tcBorders>
+            <w:tcMar>
+              <w:top w:type="dxa" w:w="50"/>
+              <w:left w:type="dxa" w:w="90"/>
+              <w:bottom w:type="dxa" w:w="50"/>
+              <w:right w:type="dxa" w:w="90"/>
+            </w:tcMar>
+          </w:tcPr>
+          <w:p>
+            <w:r>
+              <w:rPr>
+                <w:rFonts w:ascii="Calibri" w:cs="Calibri" w:eastAsia="Calibri" w:hAnsi="Calibri"/>
+                <w:b w:val="false"/>
+                <w:bCs w:val="false"/>
+                <w:sz w:val="18"/>
+                <w:szCs w:val="18"/>
+              </w:rPr>
+              <w:t xml:space="preserve">API pública</w:t>
+            </w:r>
+          </w:p>
+        </w:tc>
+        <w:tc>
+          <w:tcPr>
+            <w:tcW w:type="dxa" w:w="2100"/>
+            <w:tcBorders>
+              <w:top w:val="single" w:color="8496B0" w:sz="4"/>
+              <w:left w:val="single" w:color="8496B0" w:sz="4"/>
+              <w:bottom w:val="single" w:color="8496B0" w:sz="4"/>
+              <w:right w:val="single" w:color="8496B0" w:sz="4"/>
+            </w:tcBorders>
+            <w:tcMar>
+              <w:top w:type="dxa" w:w="50"/>
+              <w:left w:type="dxa" w:w="90"/>
+              <w:bottom w:type="dxa" w:w="50"/>
+              <w:right w:type="dxa" w:w="90"/>
+            </w:tcMar>
+          </w:tcPr>
+          <w:p>
+            <w:r>
+              <w:rPr>
+                <w:rFonts w:ascii="Calibri" w:cs="Calibri" w:eastAsia="Calibri" w:hAnsi="Calibri"/>
+                <w:b w:val="false"/>
+                <w:bCs w:val="false"/>
+                <w:sz w:val="18"/>
+                <w:szCs w:val="18"/>
+              </w:rPr>
+              <w:t xml:space="preserve">Sistemas externos autorizados y el propio portal web</w:t>
+            </w:r>
+          </w:p>
+        </w:tc>
+        <w:tc>
+          <w:tcPr>
+            <w:tcW w:type="dxa" w:w="2600"/>
+            <w:tcBorders>
+              <w:top w:val="single" w:color="8496B0" w:sz="4"/>
+              <w:left w:val="single" w:color="8496B0" w:sz="4"/>
+              <w:bottom w:val="single" w:color="8496B0" w:sz="4"/>
+              <w:right w:val="single" w:color="8496B0" w:sz="4"/>
+            </w:tcBorders>
+            <w:tcMar>
+              <w:top w:type="dxa" w:w="50"/>
+              <w:left w:type="dxa" w:w="90"/>
+              <w:bottom w:type="dxa" w:w="50"/>
+              <w:right w:type="dxa" w:w="90"/>
+            </w:tcMar>
+          </w:tcPr>
+          <w:p>
+            <w:r>
+              <w:rPr>
+                <w:rFonts w:ascii="Calibri" w:cs="Calibri" w:eastAsia="Calibri" w:hAnsi="Calibri"/>
+                <w:b w:val="false"/>
+                <w:bCs w:val="false"/>
+                <w:sz w:val="18"/>
+                <w:szCs w:val="18"/>
+              </w:rPr>
+              <w:t xml:space="preserve">Django REST Framework, clave de API, drf-spectacular</w:t>
+            </w:r>
+          </w:p>
+        </w:tc>
+        <w:tc>
+          <w:tcPr>
+            <w:tcW w:type="dxa" w:w="2660"/>
+            <w:tcBorders>
+              <w:top w:val="single" w:color="8496B0" w:sz="4"/>
+              <w:left w:val="single" w:color="8496B0" w:sz="4"/>
+              <w:bottom w:val="single" w:color="8496B0" w:sz="4"/>
+              <w:right w:val="single" w:color="8496B0" w:sz="4"/>
+            </w:tcBorders>
+            <w:tcMar>
+              <w:top w:type="dxa" w:w="50"/>
+              <w:left w:type="dxa" w:w="90"/>
+              <w:bottom w:type="dxa" w:w="50"/>
+              <w:right w:type="dxa" w:w="90"/>
+            </w:tcMar>
+          </w:tcPr>
+          <w:p>
+            <w:r>
+              <w:rPr>
+                <w:rFonts w:ascii="Calibri" w:cs="Calibri" w:eastAsia="Calibri" w:hAnsi="Calibri"/>
+                <w:b w:val="false"/>
+                <w:bCs w:val="false"/>
+                <w:sz w:val="18"/>
+                <w:szCs w:val="18"/>
+              </w:rPr>
+              <w:t xml:space="preserve">Mediante los mismos servicios de negocio que la API interna. Sólo consultas, sin montos, costos ni datos personales.</w:t>
+            </w:r>
+          </w:p>
+        </w:tc>
+      </w:tr>
     </w:tbl>
     <w:p>
       <w:pPr>
@@ -1472,6 +1593,15 @@
       </w:pPr>
       <w:r>
         <w:t xml:space="preserve">La API y el portal web se ejecutan en el mismo proceso Django y comparten la capa de servicios de negocio. Así, una regla —por ejemplo, que la orden de compra sólo nace de una cotización aceptada— se implementa una sola vez y produce el mismo resultado cualquiera sea la interfaz que origine la operación.</w:t>
+      </w:r>
+    </w:p>
+    <w:p>
+      <w:pPr>
+        <w:spacing w:after="120"/>
+        <w:jc w:val="both"/>
+      </w:pPr>
+      <w:r>
+        <w:t xml:space="preserve">La API pública (/api/publica/v1/) se ejecuta también en ese proceso, pero separada de la API interna: no usa usuarios ni tokens JWT, sino una clave de API por consumidor, y sólo expone dos servicios de consulta, el seguimiento de pedidos y el cotizador.</w:t>
       </w:r>
     </w:p>
     <w:p>
@@ -1652,7 +1782,7 @@
                 <w:sz w:val="18"/>
                 <w:szCs w:val="18"/>
               </w:rPr>
-              <w:t xml:space="preserve">Vistas DRF (29 recursos bajo /api/v1/, más las rutas de autenticación, reportes y pendientes), vistas web, middleware</w:t>
+              <w:t xml:space="preserve">Vistas DRF (29 recursos bajo /api/v1/, más las rutas de autenticación, reportes y pendientes), API pública bajo /api/publica/v1/ con su documentación Swagger, vistas web, middleware</w:t>
             </w:r>
           </w:p>
         </w:tc>
@@ -1744,7 +1874,7 @@
                 <w:sz w:val="18"/>
                 <w:szCs w:val="18"/>
               </w:rPr>
-              <w:t xml:space="preserve">Autenticación JWT y de sesión, PermisoPorRol, middleware de cuenta y mantención</w:t>
+              <w:t xml:space="preserve">Autenticación JWT y de sesión, PermisoPorRol, clave de API con servicios asignados y límite por consumidor, middleware de cuenta y mantención</w:t>
             </w:r>
           </w:p>
         </w:tc>
@@ -2917,6 +3047,282 @@
           </w:p>
         </w:tc>
       </w:tr>
+      <w:tr>
+        <w:trPr>
+          <w:cantSplit/>
+        </w:trPr>
+        <w:tc>
+          <w:tcPr>
+            <w:tcW w:type="dxa" w:w="3000"/>
+            <w:tcBorders>
+              <w:top w:val="single" w:color="8496B0" w:sz="4"/>
+              <w:left w:val="single" w:color="8496B0" w:sz="4"/>
+              <w:bottom w:val="single" w:color="8496B0" w:sz="4"/>
+              <w:right w:val="single" w:color="8496B0" w:sz="4"/>
+            </w:tcBorders>
+            <w:tcMar>
+              <w:top w:type="dxa" w:w="50"/>
+              <w:left w:type="dxa" w:w="90"/>
+              <w:bottom w:type="dxa" w:w="50"/>
+              <w:right w:type="dxa" w:w="90"/>
+            </w:tcMar>
+          </w:tcPr>
+          <w:p>
+            <w:r>
+              <w:rPr>
+                <w:rFonts w:ascii="Calibri" w:cs="Calibri" w:eastAsia="Calibri" w:hAnsi="Calibri"/>
+                <w:b w:val="false"/>
+                <w:bCs w:val="false"/>
+                <w:sz w:val="18"/>
+                <w:szCs w:val="18"/>
+              </w:rPr>
+              <w:t xml:space="preserve">API pública separada de la API interna, con una clave de API por consumidor.</w:t>
+            </w:r>
+          </w:p>
+        </w:tc>
+        <w:tc>
+          <w:tcPr>
+            <w:tcW w:type="dxa" w:w="2400"/>
+            <w:tcBorders>
+              <w:top w:val="single" w:color="8496B0" w:sz="4"/>
+              <w:left w:val="single" w:color="8496B0" w:sz="4"/>
+              <w:bottom w:val="single" w:color="8496B0" w:sz="4"/>
+              <w:right w:val="single" w:color="8496B0" w:sz="4"/>
+            </w:tcBorders>
+            <w:tcMar>
+              <w:top w:type="dxa" w:w="50"/>
+              <w:left w:type="dxa" w:w="90"/>
+              <w:bottom w:type="dxa" w:w="50"/>
+              <w:right w:type="dxa" w:w="90"/>
+            </w:tcMar>
+          </w:tcPr>
+          <w:p>
+            <w:r>
+              <w:rPr>
+                <w:rFonts w:ascii="Calibri" w:cs="Calibri" w:eastAsia="Calibri" w:hAnsi="Calibri"/>
+                <w:b w:val="false"/>
+                <w:bCs w:val="false"/>
+                <w:sz w:val="18"/>
+                <w:szCs w:val="18"/>
+              </w:rPr>
+              <w:t xml:space="preserve">Abrir la API interna /api/v1/ a terceros con usuarios y JWT.</w:t>
+            </w:r>
+          </w:p>
+        </w:tc>
+        <w:tc>
+          <w:tcPr>
+            <w:tcW w:type="dxa" w:w="3960"/>
+            <w:tcBorders>
+              <w:top w:val="single" w:color="8496B0" w:sz="4"/>
+              <w:left w:val="single" w:color="8496B0" w:sz="4"/>
+              <w:bottom w:val="single" w:color="8496B0" w:sz="4"/>
+              <w:right w:val="single" w:color="8496B0" w:sz="4"/>
+            </w:tcBorders>
+            <w:tcMar>
+              <w:top w:type="dxa" w:w="50"/>
+              <w:left w:type="dxa" w:w="90"/>
+              <w:bottom w:type="dxa" w:w="50"/>
+              <w:right w:type="dxa" w:w="90"/>
+            </w:tcMar>
+          </w:tcPr>
+          <w:p>
+            <w:r>
+              <w:rPr>
+                <w:rFonts w:ascii="Calibri" w:cs="Calibri" w:eastAsia="Calibri" w:hAnsi="Calibri"/>
+                <w:b w:val="false"/>
+                <w:bCs w:val="false"/>
+                <w:sz w:val="18"/>
+                <w:szCs w:val="18"/>
+              </w:rPr>
+              <w:t xml:space="preserve">La API interna da acceso a todo lo que permite un rol; la pública sólo a consultas acotadas. La clave identifica al sistema que consulta, permite limitarlo y revocarlo sin afectar a los usuarios internos, y cada servicio se autoriza por separado.</w:t>
+            </w:r>
+          </w:p>
+        </w:tc>
+      </w:tr>
+      <w:tr>
+        <w:trPr>
+          <w:cantSplit/>
+        </w:trPr>
+        <w:tc>
+          <w:tcPr>
+            <w:tcW w:type="dxa" w:w="3000"/>
+            <w:tcBorders>
+              <w:top w:val="single" w:color="8496B0" w:sz="4"/>
+              <w:left w:val="single" w:color="8496B0" w:sz="4"/>
+              <w:bottom w:val="single" w:color="8496B0" w:sz="4"/>
+              <w:right w:val="single" w:color="8496B0" w:sz="4"/>
+            </w:tcBorders>
+            <w:tcMar>
+              <w:top w:type="dxa" w:w="50"/>
+              <w:left w:type="dxa" w:w="90"/>
+              <w:bottom w:type="dxa" w:w="50"/>
+              <w:right w:type="dxa" w:w="90"/>
+            </w:tcMar>
+          </w:tcPr>
+          <w:p>
+            <w:r>
+              <w:rPr>
+                <w:rFonts w:ascii="Calibri" w:cs="Calibri" w:eastAsia="Calibri" w:hAnsi="Calibri"/>
+                <w:b w:val="false"/>
+                <w:bCs w:val="false"/>
+                <w:sz w:val="18"/>
+                <w:szCs w:val="18"/>
+              </w:rPr>
+              <w:t xml:space="preserve">Código de seguimiento calculado con HMAC-SHA256 a partir de la orden.</w:t>
+            </w:r>
+          </w:p>
+        </w:tc>
+        <w:tc>
+          <w:tcPr>
+            <w:tcW w:type="dxa" w:w="2400"/>
+            <w:tcBorders>
+              <w:top w:val="single" w:color="8496B0" w:sz="4"/>
+              <w:left w:val="single" w:color="8496B0" w:sz="4"/>
+              <w:bottom w:val="single" w:color="8496B0" w:sz="4"/>
+              <w:right w:val="single" w:color="8496B0" w:sz="4"/>
+            </w:tcBorders>
+            <w:tcMar>
+              <w:top w:type="dxa" w:w="50"/>
+              <w:left w:type="dxa" w:w="90"/>
+              <w:bottom w:type="dxa" w:w="50"/>
+              <w:right w:type="dxa" w:w="90"/>
+            </w:tcMar>
+          </w:tcPr>
+          <w:p>
+            <w:r>
+              <w:rPr>
+                <w:rFonts w:ascii="Calibri" w:cs="Calibri" w:eastAsia="Calibri" w:hAnsi="Calibri"/>
+                <w:b w:val="false"/>
+                <w:bCs w:val="false"/>
+                <w:sz w:val="18"/>
+                <w:szCs w:val="18"/>
+              </w:rPr>
+              <w:t xml:space="preserve">Guardar un código aleatorio en la orden de compra.</w:t>
+            </w:r>
+          </w:p>
+        </w:tc>
+        <w:tc>
+          <w:tcPr>
+            <w:tcW w:type="dxa" w:w="3960"/>
+            <w:tcBorders>
+              <w:top w:val="single" w:color="8496B0" w:sz="4"/>
+              <w:left w:val="single" w:color="8496B0" w:sz="4"/>
+              <w:bottom w:val="single" w:color="8496B0" w:sz="4"/>
+              <w:right w:val="single" w:color="8496B0" w:sz="4"/>
+            </w:tcBorders>
+            <w:tcMar>
+              <w:top w:type="dxa" w:w="50"/>
+              <w:left w:type="dxa" w:w="90"/>
+              <w:bottom w:type="dxa" w:w="50"/>
+              <w:right w:type="dxa" w:w="90"/>
+            </w:tcMar>
+          </w:tcPr>
+          <w:p>
+            <w:r>
+              <w:rPr>
+                <w:rFonts w:ascii="Calibri" w:cs="Calibri" w:eastAsia="Calibri" w:hAnsi="Calibri"/>
+                <w:b w:val="false"/>
+                <w:bCs w:val="false"/>
+                <w:sz w:val="18"/>
+                <w:szCs w:val="18"/>
+              </w:rPr>
+              <w:t xml:space="preserve">No agrega columnas ni migraciones, no queda expuesto en un respaldo de la base de datos y no se puede adivinar sin la clave secreta del servidor.</w:t>
+            </w:r>
+          </w:p>
+        </w:tc>
+      </w:tr>
+      <w:tr>
+        <w:trPr>
+          <w:cantSplit/>
+        </w:trPr>
+        <w:tc>
+          <w:tcPr>
+            <w:tcW w:type="dxa" w:w="3000"/>
+            <w:tcBorders>
+              <w:top w:val="single" w:color="8496B0" w:sz="4"/>
+              <w:left w:val="single" w:color="8496B0" w:sz="4"/>
+              <w:bottom w:val="single" w:color="8496B0" w:sz="4"/>
+              <w:right w:val="single" w:color="8496B0" w:sz="4"/>
+            </w:tcBorders>
+            <w:tcMar>
+              <w:top w:type="dxa" w:w="50"/>
+              <w:left w:type="dxa" w:w="90"/>
+              <w:bottom w:type="dxa" w:w="50"/>
+              <w:right w:type="dxa" w:w="90"/>
+            </w:tcMar>
+          </w:tcPr>
+          <w:p>
+            <w:r>
+              <w:rPr>
+                <w:rFonts w:ascii="Calibri" w:cs="Calibri" w:eastAsia="Calibri" w:hAnsi="Calibri"/>
+                <w:b w:val="false"/>
+                <w:bCs w:val="false"/>
+                <w:sz w:val="18"/>
+                <w:szCs w:val="18"/>
+              </w:rPr>
+              <w:t xml:space="preserve">Documentación OpenAPI generada con drf-spectacular y Swagger UI servido por el propio sistema.</w:t>
+            </w:r>
+          </w:p>
+        </w:tc>
+        <w:tc>
+          <w:tcPr>
+            <w:tcW w:type="dxa" w:w="2400"/>
+            <w:tcBorders>
+              <w:top w:val="single" w:color="8496B0" w:sz="4"/>
+              <w:left w:val="single" w:color="8496B0" w:sz="4"/>
+              <w:bottom w:val="single" w:color="8496B0" w:sz="4"/>
+              <w:right w:val="single" w:color="8496B0" w:sz="4"/>
+            </w:tcBorders>
+            <w:tcMar>
+              <w:top w:type="dxa" w:w="50"/>
+              <w:left w:type="dxa" w:w="90"/>
+              <w:bottom w:type="dxa" w:w="50"/>
+              <w:right w:type="dxa" w:w="90"/>
+            </w:tcMar>
+          </w:tcPr>
+          <w:p>
+            <w:r>
+              <w:rPr>
+                <w:rFonts w:ascii="Calibri" w:cs="Calibri" w:eastAsia="Calibri" w:hAnsi="Calibri"/>
+                <w:b w:val="false"/>
+                <w:bCs w:val="false"/>
+                <w:sz w:val="18"/>
+                <w:szCs w:val="18"/>
+              </w:rPr>
+              <w:t xml:space="preserve">Documentación escrita a mano o Swagger UI cargado desde un CDN.</w:t>
+            </w:r>
+          </w:p>
+        </w:tc>
+        <w:tc>
+          <w:tcPr>
+            <w:tcW w:type="dxa" w:w="3960"/>
+            <w:tcBorders>
+              <w:top w:val="single" w:color="8496B0" w:sz="4"/>
+              <w:left w:val="single" w:color="8496B0" w:sz="4"/>
+              <w:bottom w:val="single" w:color="8496B0" w:sz="4"/>
+              <w:right w:val="single" w:color="8496B0" w:sz="4"/>
+            </w:tcBorders>
+            <w:tcMar>
+              <w:top w:type="dxa" w:w="50"/>
+              <w:left w:type="dxa" w:w="90"/>
+              <w:bottom w:type="dxa" w:w="50"/>
+              <w:right w:type="dxa" w:w="90"/>
+            </w:tcMar>
+          </w:tcPr>
+          <w:p>
+            <w:r>
+              <w:rPr>
+                <w:rFonts w:ascii="Calibri" w:cs="Calibri" w:eastAsia="Calibri" w:hAnsi="Calibri"/>
+                <w:b w:val="false"/>
+                <w:bCs w:val="false"/>
+                <w:sz w:val="18"/>
+                <w:szCs w:val="18"/>
+              </w:rPr>
+              <w:t xml:space="preserve">El esquema se genera del código y no se desactualiza; servir Swagger desde el sistema evita depender de un CDN externo.</w:t>
+            </w:r>
+          </w:p>
+        </w:tc>
+      </w:tr>
     </w:tbl>
     <w:p>
       <w:pPr>
@@ -2962,7 +3368,7 @@
       <w:r>
         <w:drawing>
           <wp:inline distT="0" distB="0" distL="0" distR="0">
-            <wp:extent cx="8039100" cy="5391150"/>
+            <wp:extent cx="6382393" cy="5391149"/>
             <wp:effectExtent t="0" r="0" b="0" l="0"/>
             <wp:docPr id="1" name="Figura 1. Diagrama de componentes de SITRAFO." descr="Figura 1. Diagrama de componentes de SITRAFO." title="Figura 1. Diagrama de componentes de SITRAFO."/>
             <wp:cNvGraphicFramePr>
@@ -2978,7 +3384,7 @@
                     </pic:cNvPicPr>
                   </pic:nvPicPr>
                   <pic:blipFill>
-                    <a:blip r:embed="rId45" cstate="none"/>
+                    <a:blip r:embed="rId55" cstate="none"/>
                     <a:srcRect/>
                     <a:stretch>
                       <a:fillRect/>
@@ -2987,7 +3393,7 @@
                   <pic:spPr bwMode="auto">
                     <a:xfrm>
                       <a:off x="0" y="0"/>
-                      <a:ext cx="8039100" cy="5391150"/>
+                      <a:ext cx="6382393" cy="5391149"/>
                     </a:xfrm>
                     <a:prstGeom prst="rect">
                       <a:avLst/>
@@ -3806,6 +4212,69 @@
                 <w:szCs w:val="18"/>
               </w:rPr>
               <w:t xml:space="preserve">Portal del cliente, formularios y middleware de mantención y de cuenta suspendida.</w:t>
+            </w:r>
+          </w:p>
+        </w:tc>
+      </w:tr>
+      <w:tr>
+        <w:trPr>
+          <w:cantSplit/>
+        </w:trPr>
+        <w:tc>
+          <w:tcPr>
+            <w:tcW w:type="dxa" w:w="2400"/>
+            <w:tcBorders>
+              <w:top w:val="single" w:color="8496B0" w:sz="4"/>
+              <w:left w:val="single" w:color="8496B0" w:sz="4"/>
+              <w:bottom w:val="single" w:color="8496B0" w:sz="4"/>
+              <w:right w:val="single" w:color="8496B0" w:sz="4"/>
+            </w:tcBorders>
+            <w:tcMar>
+              <w:top w:type="dxa" w:w="50"/>
+              <w:left w:type="dxa" w:w="90"/>
+              <w:bottom w:type="dxa" w:w="50"/>
+              <w:right w:type="dxa" w:w="90"/>
+            </w:tcMar>
+          </w:tcPr>
+          <w:p>
+            <w:r>
+              <w:rPr>
+                <w:rFonts w:ascii="Calibri" w:cs="Calibri" w:eastAsia="Calibri" w:hAnsi="Calibri"/>
+                <w:b w:val="false"/>
+                <w:bCs w:val="false"/>
+                <w:sz w:val="18"/>
+                <w:szCs w:val="18"/>
+              </w:rPr>
+              <w:t xml:space="preserve">apps.api_publica</w:t>
+            </w:r>
+          </w:p>
+        </w:tc>
+        <w:tc>
+          <w:tcPr>
+            <w:tcW w:type="dxa" w:w="6960"/>
+            <w:tcBorders>
+              <w:top w:val="single" w:color="8496B0" w:sz="4"/>
+              <w:left w:val="single" w:color="8496B0" w:sz="4"/>
+              <w:bottom w:val="single" w:color="8496B0" w:sz="4"/>
+              <w:right w:val="single" w:color="8496B0" w:sz="4"/>
+            </w:tcBorders>
+            <w:tcMar>
+              <w:top w:type="dxa" w:w="50"/>
+              <w:left w:type="dxa" w:w="90"/>
+              <w:bottom w:type="dxa" w:w="50"/>
+              <w:right w:type="dxa" w:w="90"/>
+            </w:tcMar>
+          </w:tcPr>
+          <w:p>
+            <w:r>
+              <w:rPr>
+                <w:rFonts w:ascii="Calibri" w:cs="Calibri" w:eastAsia="Calibri" w:hAnsi="Calibri"/>
+                <w:b w:val="false"/>
+                <w:bCs w:val="false"/>
+                <w:sz w:val="18"/>
+                <w:szCs w:val="18"/>
+              </w:rPr>
+              <w:t xml:space="preserve">API pública para terceros: seguimiento de pedidos y cotizador, clave de API con servicios asignados, límite por consumidor, registro de uso y documentación Swagger. No agrega tablas.</w:t>
             </w:r>
           </w:p>
         </w:tc>
@@ -5427,6 +5896,98 @@
                 <w:sz w:val="18"/>
                 <w:szCs w:val="18"/>
               </w:rPr>
+              <w:t xml:space="preserve">API pública</w:t>
+            </w:r>
+          </w:p>
+        </w:tc>
+        <w:tc>
+          <w:tcPr>
+            <w:tcW w:type="dxa" w:w="5560"/>
+            <w:tcBorders>
+              <w:top w:val="single" w:color="8496B0" w:sz="4"/>
+              <w:left w:val="single" w:color="8496B0" w:sz="4"/>
+              <w:bottom w:val="single" w:color="8496B0" w:sz="4"/>
+              <w:right w:val="single" w:color="8496B0" w:sz="4"/>
+            </w:tcBorders>
+            <w:tcMar>
+              <w:top w:type="dxa" w:w="50"/>
+              <w:left w:type="dxa" w:w="90"/>
+              <w:bottom w:type="dxa" w:w="50"/>
+              <w:right w:type="dxa" w:w="90"/>
+            </w:tcMar>
+          </w:tcPr>
+          <w:p>
+            <w:r>
+              <w:rPr>
+                <w:rFonts w:ascii="Calibri" w:cs="Calibri" w:eastAsia="Calibri" w:hAnsi="Calibri"/>
+                <w:b w:val="false"/>
+                <w:bCs w:val="false"/>
+                <w:sz w:val="18"/>
+                <w:szCs w:val="18"/>
+              </w:rPr>
+              <w:t xml:space="preserve">Clave de API por consumidor en el encabezado X-API-Key, con servicios asignados y límite de 60 consultas por minuto. Código de seguimiento con HMAC-SHA256, comparado en tiempo constante, y el mismo 404 ante un número o un código incorrectos. Respuestas sin montos, costos, márgenes ni datos personales. Cada consulta queda en log_integracion, sin el código.</w:t>
+            </w:r>
+          </w:p>
+        </w:tc>
+        <w:tc>
+          <w:tcPr>
+            <w:tcW w:type="dxa" w:w="1800"/>
+            <w:tcBorders>
+              <w:top w:val="single" w:color="8496B0" w:sz="4"/>
+              <w:left w:val="single" w:color="8496B0" w:sz="4"/>
+              <w:bottom w:val="single" w:color="8496B0" w:sz="4"/>
+              <w:right w:val="single" w:color="8496B0" w:sz="4"/>
+            </w:tcBorders>
+            <w:tcMar>
+              <w:top w:type="dxa" w:w="50"/>
+              <w:left w:type="dxa" w:w="90"/>
+              <w:bottom w:type="dxa" w:w="50"/>
+              <w:right w:type="dxa" w:w="90"/>
+            </w:tcMar>
+          </w:tcPr>
+          <w:p>
+            <w:r>
+              <w:rPr>
+                <w:rFonts w:ascii="Calibri" w:cs="Calibri" w:eastAsia="Calibri" w:hAnsi="Calibri"/>
+                <w:b w:val="false"/>
+                <w:bCs w:val="false"/>
+                <w:sz w:val="18"/>
+                <w:szCs w:val="18"/>
+              </w:rPr>
+              <w:t xml:space="preserve">RF-INT-04, RNF-21</w:t>
+            </w:r>
+          </w:p>
+        </w:tc>
+      </w:tr>
+      <w:tr>
+        <w:trPr>
+          <w:cantSplit/>
+        </w:trPr>
+        <w:tc>
+          <w:tcPr>
+            <w:tcW w:type="dxa" w:w="2000"/>
+            <w:tcBorders>
+              <w:top w:val="single" w:color="8496B0" w:sz="4"/>
+              <w:left w:val="single" w:color="8496B0" w:sz="4"/>
+              <w:bottom w:val="single" w:color="8496B0" w:sz="4"/>
+              <w:right w:val="single" w:color="8496B0" w:sz="4"/>
+            </w:tcBorders>
+            <w:tcMar>
+              <w:top w:type="dxa" w:w="50"/>
+              <w:left w:type="dxa" w:w="90"/>
+              <w:bottom w:type="dxa" w:w="50"/>
+              <w:right w:type="dxa" w:w="90"/>
+            </w:tcMar>
+          </w:tcPr>
+          <w:p>
+            <w:r>
+              <w:rPr>
+                <w:rFonts w:ascii="Calibri" w:cs="Calibri" w:eastAsia="Calibri" w:hAnsi="Calibri"/>
+                <w:b w:val="false"/>
+                <w:bCs w:val="false"/>
+                <w:sz w:val="18"/>
+                <w:szCs w:val="18"/>
+              </w:rPr>
               <w:t xml:space="preserve">Trazabilidad</w:t>
             </w:r>
           </w:p>
@@ -6280,6 +6841,15 @@
           <w:szCs w:val="19"/>
         </w:rPr>
         <w:t xml:space="preserve">Toda llamada se realiza con reintentos y espera incremental, y queda registrada en la tabla log_integracion con su código de respuesta, latencia y resultado (RF-INT-01, RF-INT-02).</w:t>
+      </w:r>
+    </w:p>
+    <w:p>
+      <w:pPr>
+        <w:spacing w:after="120"/>
+        <w:jc w:val="both"/>
+      </w:pPr>
+      <w:r>
+        <w:t xml:space="preserve">Además de consumir estos cinco servicios, SITRAFO expone sus propias APIs públicas para terceros en /api/publica/v1/: el seguimiento de pedidos y el cotizador (diagramas SEC-10 y SEC-11 del documento SEC-01). Están documentadas en /api/publica/v1/docs/ y sus consultas quedan en el mismo registro de integraciones, como api_seguimiento y api_cotizador.</w:t>
       </w:r>
     </w:p>
     <w:p>
@@ -7554,6 +8124,98 @@
                 <w:sz w:val="18"/>
                 <w:szCs w:val="18"/>
               </w:rPr>
+              <w:t xml:space="preserve">Documentación de la API</w:t>
+            </w:r>
+          </w:p>
+        </w:tc>
+        <w:tc>
+          <w:tcPr>
+            <w:tcW w:type="dxa" w:w="4400"/>
+            <w:tcBorders>
+              <w:top w:val="single" w:color="8496B0" w:sz="4"/>
+              <w:left w:val="single" w:color="8496B0" w:sz="4"/>
+              <w:bottom w:val="single" w:color="8496B0" w:sz="4"/>
+              <w:right w:val="single" w:color="8496B0" w:sz="4"/>
+            </w:tcBorders>
+            <w:tcMar>
+              <w:top w:type="dxa" w:w="50"/>
+              <w:left w:type="dxa" w:w="90"/>
+              <w:bottom w:type="dxa" w:w="50"/>
+              <w:right w:type="dxa" w:w="90"/>
+            </w:tcMar>
+          </w:tcPr>
+          <w:p>
+            <w:r>
+              <w:rPr>
+                <w:rFonts w:ascii="Calibri" w:cs="Calibri" w:eastAsia="Calibri" w:hAnsi="Calibri"/>
+                <w:b w:val="false"/>
+                <w:bCs w:val="false"/>
+                <w:sz w:val="18"/>
+                <w:szCs w:val="18"/>
+              </w:rPr>
+              <w:t xml:space="preserve">drf-spectacular + drf-spectacular-sidecar (OpenAPI 3, Swagger UI)</w:t>
+            </w:r>
+          </w:p>
+        </w:tc>
+        <w:tc>
+          <w:tcPr>
+            <w:tcW w:type="dxa" w:w="2360"/>
+            <w:tcBorders>
+              <w:top w:val="single" w:color="8496B0" w:sz="4"/>
+              <w:left w:val="single" w:color="8496B0" w:sz="4"/>
+              <w:bottom w:val="single" w:color="8496B0" w:sz="4"/>
+              <w:right w:val="single" w:color="8496B0" w:sz="4"/>
+            </w:tcBorders>
+            <w:tcMar>
+              <w:top w:type="dxa" w:w="50"/>
+              <w:left w:type="dxa" w:w="90"/>
+              <w:bottom w:type="dxa" w:w="50"/>
+              <w:right w:type="dxa" w:w="90"/>
+            </w:tcMar>
+          </w:tcPr>
+          <w:p>
+            <w:r>
+              <w:rPr>
+                <w:rFonts w:ascii="Calibri" w:cs="Calibri" w:eastAsia="Calibri" w:hAnsi="Calibri"/>
+                <w:b w:val="false"/>
+                <w:bCs w:val="false"/>
+                <w:sz w:val="18"/>
+                <w:szCs w:val="18"/>
+              </w:rPr>
+              <w:t xml:space="preserve">0.30.0 / 2026.10.1</w:t>
+            </w:r>
+          </w:p>
+        </w:tc>
+      </w:tr>
+      <w:tr>
+        <w:trPr>
+          <w:cantSplit/>
+        </w:trPr>
+        <w:tc>
+          <w:tcPr>
+            <w:tcW w:type="dxa" w:w="2600"/>
+            <w:tcBorders>
+              <w:top w:val="single" w:color="8496B0" w:sz="4"/>
+              <w:left w:val="single" w:color="8496B0" w:sz="4"/>
+              <w:bottom w:val="single" w:color="8496B0" w:sz="4"/>
+              <w:right w:val="single" w:color="8496B0" w:sz="4"/>
+            </w:tcBorders>
+            <w:tcMar>
+              <w:top w:type="dxa" w:w="50"/>
+              <w:left w:type="dxa" w:w="90"/>
+              <w:bottom w:type="dxa" w:w="50"/>
+              <w:right w:type="dxa" w:w="90"/>
+            </w:tcMar>
+          </w:tcPr>
+          <w:p>
+            <w:r>
+              <w:rPr>
+                <w:rFonts w:ascii="Calibri" w:cs="Calibri" w:eastAsia="Calibri" w:hAnsi="Calibri"/>
+                <w:b w:val="false"/>
+                <w:bCs w:val="false"/>
+                <w:sz w:val="18"/>
+                <w:szCs w:val="18"/>
+              </w:rPr>
               <w:t xml:space="preserve">Base de datos</w:t>
             </w:r>
           </w:p>
@@ -8565,6 +9227,127 @@
                 <w:szCs w:val="20"/>
               </w:rPr>
               <w:t xml:space="preserve">Estado «Liberada por calidad» de la orden de trabajo (22 estados), aprobación del control en el diagrama de actividad, bandeja de pendientes y avisos por correo entre roles.</w:t>
+            </w:r>
+          </w:p>
+        </w:tc>
+      </w:tr>
+      <w:tr>
+        <w:trPr>
+          <w:cantSplit/>
+        </w:trPr>
+        <w:tc>
+          <w:tcPr>
+            <w:tcW w:type="dxa" w:w="1000"/>
+            <w:tcBorders>
+              <w:top w:val="single" w:color="8496B0" w:sz="4"/>
+              <w:left w:val="single" w:color="8496B0" w:sz="4"/>
+              <w:bottom w:val="single" w:color="8496B0" w:sz="4"/>
+              <w:right w:val="single" w:color="8496B0" w:sz="4"/>
+            </w:tcBorders>
+            <w:tcMar>
+              <w:top w:type="dxa" w:w="50"/>
+              <w:left w:type="dxa" w:w="90"/>
+              <w:bottom w:type="dxa" w:w="50"/>
+              <w:right w:type="dxa" w:w="90"/>
+            </w:tcMar>
+          </w:tcPr>
+          <w:p>
+            <w:r>
+              <w:rPr>
+                <w:rFonts w:ascii="Calibri" w:cs="Calibri" w:eastAsia="Calibri" w:hAnsi="Calibri"/>
+                <w:b w:val="false"/>
+                <w:bCs w:val="false"/>
+                <w:sz w:val="20"/>
+                <w:szCs w:val="20"/>
+              </w:rPr>
+              <w:t xml:space="preserve">1.2</w:t>
+            </w:r>
+          </w:p>
+        </w:tc>
+        <w:tc>
+          <w:tcPr>
+            <w:tcW w:type="dxa" w:w="1500"/>
+            <w:tcBorders>
+              <w:top w:val="single" w:color="8496B0" w:sz="4"/>
+              <w:left w:val="single" w:color="8496B0" w:sz="4"/>
+              <w:bottom w:val="single" w:color="8496B0" w:sz="4"/>
+              <w:right w:val="single" w:color="8496B0" w:sz="4"/>
+            </w:tcBorders>
+            <w:tcMar>
+              <w:top w:type="dxa" w:w="50"/>
+              <w:left w:type="dxa" w:w="90"/>
+              <w:bottom w:type="dxa" w:w="50"/>
+              <w:right w:type="dxa" w:w="90"/>
+            </w:tcMar>
+          </w:tcPr>
+          <w:p>
+            <w:r>
+              <w:rPr>
+                <w:rFonts w:ascii="Calibri" w:cs="Calibri" w:eastAsia="Calibri" w:hAnsi="Calibri"/>
+                <w:b w:val="false"/>
+                <w:bCs w:val="false"/>
+                <w:sz w:val="20"/>
+                <w:szCs w:val="20"/>
+              </w:rPr>
+              <w:t xml:space="preserve">19-10-2026</w:t>
+            </w:r>
+          </w:p>
+        </w:tc>
+        <w:tc>
+          <w:tcPr>
+            <w:tcW w:type="dxa" w:w="2300"/>
+            <w:tcBorders>
+              <w:top w:val="single" w:color="8496B0" w:sz="4"/>
+              <w:left w:val="single" w:color="8496B0" w:sz="4"/>
+              <w:bottom w:val="single" w:color="8496B0" w:sz="4"/>
+              <w:right w:val="single" w:color="8496B0" w:sz="4"/>
+            </w:tcBorders>
+            <w:tcMar>
+              <w:top w:type="dxa" w:w="50"/>
+              <w:left w:type="dxa" w:w="90"/>
+              <w:bottom w:type="dxa" w:w="50"/>
+              <w:right w:type="dxa" w:w="90"/>
+            </w:tcMar>
+          </w:tcPr>
+          <w:p>
+            <w:r>
+              <w:rPr>
+                <w:rFonts w:ascii="Calibri" w:cs="Calibri" w:eastAsia="Calibri" w:hAnsi="Calibri"/>
+                <w:b w:val="false"/>
+                <w:bCs w:val="false"/>
+                <w:sz w:val="20"/>
+                <w:szCs w:val="20"/>
+              </w:rPr>
+              <w:t xml:space="preserve">Benjamín Delgado Bravo</w:t>
+            </w:r>
+          </w:p>
+        </w:tc>
+        <w:tc>
+          <w:tcPr>
+            <w:tcW w:type="dxa" w:w="4560"/>
+            <w:tcBorders>
+              <w:top w:val="single" w:color="8496B0" w:sz="4"/>
+              <w:left w:val="single" w:color="8496B0" w:sz="4"/>
+              <w:bottom w:val="single" w:color="8496B0" w:sz="4"/>
+              <w:right w:val="single" w:color="8496B0" w:sz="4"/>
+            </w:tcBorders>
+            <w:tcMar>
+              <w:top w:type="dxa" w:w="50"/>
+              <w:left w:type="dxa" w:w="90"/>
+              <w:bottom w:type="dxa" w:w="50"/>
+              <w:right w:type="dxa" w:w="90"/>
+            </w:tcMar>
+          </w:tcPr>
+          <w:p>
+            <w:r>
+              <w:rPr>
+                <w:rFonts w:ascii="Calibri" w:cs="Calibri" w:eastAsia="Calibri" w:hAnsi="Calibri"/>
+                <w:b w:val="false"/>
+                <w:bCs w:val="false"/>
+                <w:sz w:val="20"/>
+                <w:szCs w:val="20"/>
+              </w:rPr>
+              <w:t xml:space="preserve">API pública propia: componente en COMP-01, aplicación apps.api_publica, decisiones arquitectónicas (clave de API, código de seguimiento con HMAC y Swagger), seguridad e integraciones.</w:t>
             </w:r>
           </w:p>
         </w:tc>
@@ -9192,7 +9975,7 @@
         <w:sz w:val="16"/>
         <w:szCs w:val="16"/>
       </w:rPr>
-      <w:t xml:space="preserve">SITRAFO · ARQ-01 Arquitectura y Diseño del Comportamiento · v1.1</w:t>
+      <w:t xml:space="preserve">SITRAFO · ARQ-01 Arquitectura y Diseño del Comportamiento · v1.2</w:t>
     </w:r>
   </w:p>
 </w:hdr>
@@ -9212,7 +9995,7 @@
         <w:sz w:val="16"/>
         <w:szCs w:val="16"/>
       </w:rPr>
-      <w:t xml:space="preserve">SITRAFO · ARQ-01 Arquitectura y Diseño del Comportamiento · v1.1</w:t>
+      <w:t xml:space="preserve">SITRAFO · ARQ-01 Arquitectura y Diseño del Comportamiento · v1.2</w:t>
     </w:r>
   </w:p>
 </w:hdr>
@@ -9232,7 +10015,7 @@
         <w:sz w:val="16"/>
         <w:szCs w:val="16"/>
       </w:rPr>
-      <w:t xml:space="preserve">SITRAFO · ARQ-01 Arquitectura y Diseño del Comportamiento · v1.1</w:t>
+      <w:t xml:space="preserve">SITRAFO · ARQ-01 Arquitectura y Diseño del Comportamiento · v1.2</w:t>
     </w:r>
   </w:p>
 </w:hdr>
@@ -9252,7 +10035,7 @@
         <w:sz w:val="16"/>
         <w:szCs w:val="16"/>
       </w:rPr>
-      <w:t xml:space="preserve">SITRAFO · ARQ-01 Arquitectura y Diseño del Comportamiento · v1.1</w:t>
+      <w:t xml:space="preserve">SITRAFO · ARQ-01 Arquitectura y Diseño del Comportamiento · v1.2</w:t>
     </w:r>
   </w:p>
 </w:hdr>
@@ -9272,7 +10055,7 @@
         <w:sz w:val="16"/>
         <w:szCs w:val="16"/>
       </w:rPr>
-      <w:t xml:space="preserve">SITRAFO · ARQ-01 Arquitectura y Diseño del Comportamiento · v1.1</w:t>
+      <w:t xml:space="preserve">SITRAFO · ARQ-01 Arquitectura y Diseño del Comportamiento · v1.2</w:t>
     </w:r>
   </w:p>
 </w:hdr>
@@ -9292,7 +10075,7 @@
         <w:sz w:val="16"/>
         <w:szCs w:val="16"/>
       </w:rPr>
-      <w:t xml:space="preserve">SITRAFO · ARQ-01 Arquitectura y Diseño del Comportamiento · v1.1</w:t>
+      <w:t xml:space="preserve">SITRAFO · ARQ-01 Arquitectura y Diseño del Comportamiento · v1.2</w:t>
     </w:r>
   </w:p>
 </w:hdr>
@@ -9312,7 +10095,7 @@
         <w:sz w:val="16"/>
         <w:szCs w:val="16"/>
       </w:rPr>
-      <w:t xml:space="preserve">SITRAFO · ARQ-01 Arquitectura y Diseño del Comportamiento · v1.1</w:t>
+      <w:t xml:space="preserve">SITRAFO · ARQ-01 Arquitectura y Diseño del Comportamiento · v1.2</w:t>
     </w:r>
   </w:p>
 </w:hdr>
@@ -9332,7 +10115,7 @@
         <w:sz w:val="16"/>
         <w:szCs w:val="16"/>
       </w:rPr>
-      <w:t xml:space="preserve">SITRAFO · ARQ-01 Arquitectura y Diseño del Comportamiento · v1.1</w:t>
+      <w:t xml:space="preserve">SITRAFO · ARQ-01 Arquitectura y Diseño del Comportamiento · v1.2</w:t>
     </w:r>
   </w:p>
 </w:hdr>
@@ -9352,7 +10135,7 @@
         <w:sz w:val="16"/>
         <w:szCs w:val="16"/>
       </w:rPr>
-      <w:t xml:space="preserve">SITRAFO · ARQ-01 Arquitectura y Diseño del Comportamiento · v1.1</w:t>
+      <w:t xml:space="preserve">SITRAFO · ARQ-01 Arquitectura y Diseño del Comportamiento · v1.2</w:t>
     </w:r>
   </w:p>
 </w:hdr>
@@ -9372,7 +10155,7 @@
         <w:sz w:val="16"/>
         <w:szCs w:val="16"/>
       </w:rPr>
-      <w:t xml:space="preserve">SITRAFO · ARQ-01 Arquitectura y Diseño del Comportamiento · v1.1</w:t>
+      <w:t xml:space="preserve">SITRAFO · ARQ-01 Arquitectura y Diseño del Comportamiento · v1.2</w:t>
     </w:r>
   </w:p>
 </w:hdr>
@@ -9392,7 +10175,7 @@
         <w:sz w:val="16"/>
         <w:szCs w:val="16"/>
       </w:rPr>
-      <w:t xml:space="preserve">SITRAFO · ARQ-01 Arquitectura y Diseño del Comportamiento · v1.1</w:t>
+      <w:t xml:space="preserve">SITRAFO · ARQ-01 Arquitectura y Diseño del Comportamiento · v1.2</w:t>
     </w:r>
   </w:p>
 </w:hdr>
@@ -9412,7 +10195,7 @@
         <w:sz w:val="16"/>
         <w:szCs w:val="16"/>
       </w:rPr>
-      <w:t xml:space="preserve">SITRAFO · ARQ-01 Arquitectura y Diseño del Comportamiento · v1.1</w:t>
+      <w:t xml:space="preserve">SITRAFO · ARQ-01 Arquitectura y Diseño del Comportamiento · v1.2</w:t>
     </w:r>
   </w:p>
 </w:hdr>
@@ -9432,7 +10215,7 @@
         <w:sz w:val="16"/>
         <w:szCs w:val="16"/>
       </w:rPr>
-      <w:t xml:space="preserve">SITRAFO · ARQ-01 Arquitectura y Diseño del Comportamiento · v1.1</w:t>
+      <w:t xml:space="preserve">SITRAFO · ARQ-01 Arquitectura y Diseño del Comportamiento · v1.2</w:t>
     </w:r>
   </w:p>
 </w:hdr>
@@ -9452,7 +10235,7 @@
         <w:sz w:val="16"/>
         <w:szCs w:val="16"/>
       </w:rPr>
-      <w:t xml:space="preserve">SITRAFO · ARQ-01 Arquitectura y Diseño del Comportamiento · v1.1</w:t>
+      <w:t xml:space="preserve">SITRAFO · ARQ-01 Arquitectura y Diseño del Comportamiento · v1.2</w:t>
     </w:r>
   </w:p>
 </w:hdr>
@@ -9472,7 +10255,7 @@
         <w:sz w:val="16"/>
         <w:szCs w:val="16"/>
       </w:rPr>
-      <w:t xml:space="preserve">SITRAFO · ARQ-01 Arquitectura y Diseño del Comportamiento · v1.1</w:t>
+      <w:t xml:space="preserve">SITRAFO · ARQ-01 Arquitectura y Diseño del Comportamiento · v1.2</w:t>
     </w:r>
   </w:p>
 </w:hdr>
@@ -9492,7 +10275,7 @@
         <w:sz w:val="16"/>
         <w:szCs w:val="16"/>
       </w:rPr>
-      <w:t xml:space="preserve">SITRAFO · ARQ-01 Arquitectura y Diseño del Comportamiento · v1.1</w:t>
+      <w:t xml:space="preserve">SITRAFO · ARQ-01 Arquitectura y Diseño del Comportamiento · v1.2</w:t>
     </w:r>
   </w:p>
 </w:hdr>
@@ -9512,7 +10295,7 @@
         <w:sz w:val="16"/>
         <w:szCs w:val="16"/>
       </w:rPr>
-      <w:t xml:space="preserve">SITRAFO · ARQ-01 Arquitectura y Diseño del Comportamiento · v1.1</w:t>
+      <w:t xml:space="preserve">SITRAFO · ARQ-01 Arquitectura y Diseño del Comportamiento · v1.2</w:t>
     </w:r>
   </w:p>
 </w:hdr>
@@ -9532,7 +10315,7 @@
         <w:sz w:val="16"/>
         <w:szCs w:val="16"/>
       </w:rPr>
-      <w:t xml:space="preserve">SITRAFO · ARQ-01 Arquitectura y Diseño del Comportamiento · v1.1</w:t>
+      <w:t xml:space="preserve">SITRAFO · ARQ-01 Arquitectura y Diseño del Comportamiento · v1.2</w:t>
     </w:r>
   </w:p>
 </w:hdr>
@@ -9552,7 +10335,7 @@
         <w:sz w:val="16"/>
         <w:szCs w:val="16"/>
       </w:rPr>
-      <w:t xml:space="preserve">SITRAFO · ARQ-01 Arquitectura y Diseño del Comportamiento · v1.1</w:t>
+      <w:t xml:space="preserve">SITRAFO · ARQ-01 Arquitectura y Diseño del Comportamiento · v1.2</w:t>
     </w:r>
   </w:p>
 </w:hdr>

</xml_diff>

<commit_message>
Docs: ARQ-01 v1.3 con la API de disponibilidad de materiales (RF-INV-09)
</commit_message>
<xml_diff>
--- a/Fase 2/Evidencias Proyecto/Evidencias de documentación/3. Análisis y diseño/SITRAFO_ARQ-01_Arquitectura_y_Diseno.docx
+++ b/Fase 2/Evidencias Proyecto/Evidencias de documentación/3. Análisis y diseño/SITRAFO_ARQ-01_Arquitectura_y_Diseno.docx
@@ -94,7 +94,7 @@
           <w:sz w:val="26"/>
           <w:szCs w:val="26"/>
         </w:rPr>
-        <w:t xml:space="preserve">ARQ-01  ·  Versión 1.2</w:t>
+        <w:t xml:space="preserve">ARQ-01  ·  Versión 1.3</w:t>
       </w:r>
     </w:p>
     <w:tbl>
@@ -866,7 +866,7 @@
                 <w:sz w:val="20"/>
                 <w:szCs w:val="20"/>
               </w:rPr>
-              <w:t xml:space="preserve">19 de octubre de 2026</w:t>
+              <w:t xml:space="preserve">22 de octubre de 2026</w:t>
             </w:r>
           </w:p>
         </w:tc>
@@ -881,6 +881,8 @@
       <w:pPr>
         <w:pStyle w:val="Heading1"/>
       </w:pPr>
+      <w:bookmarkStart w:id="880001" w:name="_Toc700001"/>
+      <w:bookmarkEnd w:id="880001"/>
       <w:r>
         <w:t xml:space="preserve">Tabla de contenidos</w:t>
       </w:r>
@@ -891,11 +893,685 @@
       </w:sdtPr>
       <w:sdtContent>
         <w:p>
+          <w:pPr>
+            <w:tabs>
+              <w:tab w:val="right" w:leader="dot" w:pos="9350"/>
+            </w:tabs>
+            <w:spacing w:after="60"/>
+            <w:ind w:left="0"/>
+          </w:pPr>
           <w:r>
-            <w:fldChar w:fldCharType="begin" w:dirty="true"/>
+            <w:fldChar w:fldCharType="begin"/>
+          </w:r>
+          <w:r>
             <w:instrText xml:space="preserve">TOC \h \o "1-2"</w:instrText>
+          </w:r>
+          <w:r>
             <w:fldChar w:fldCharType="separate"/>
           </w:r>
+          <w:hyperlink w:anchor="_Toc700001" w:history="1">
+            <w:r>
+              <w:t xml:space="preserve">Tabla de contenidos</w:t>
+            </w:r>
+            <w:r>
+              <w:tab/>
+            </w:r>
+            <w:r>
+              <w:fldChar w:fldCharType="begin"/>
+            </w:r>
+            <w:r>
+              <w:instrText xml:space="preserve"> PAGEREF _Toc700001 \h </w:instrText>
+            </w:r>
+            <w:r>
+              <w:fldChar w:fldCharType="separate"/>
+            </w:r>
+            <w:r>
+              <w:t>2</w:t>
+            </w:r>
+            <w:r>
+              <w:fldChar w:fldCharType="end"/>
+            </w:r>
+          </w:hyperlink>
+        </w:p>
+        <w:p>
+          <w:pPr>
+            <w:tabs>
+              <w:tab w:val="right" w:leader="dot" w:pos="9350"/>
+            </w:tabs>
+            <w:spacing w:after="60"/>
+            <w:ind w:left="0"/>
+          </w:pPr>
+          <w:hyperlink w:anchor="_Toc700002" w:history="1">
+            <w:r>
+              <w:t xml:space="preserve">1. Propósito y alcance</w:t>
+            </w:r>
+            <w:r>
+              <w:tab/>
+            </w:r>
+            <w:r>
+              <w:fldChar w:fldCharType="begin"/>
+            </w:r>
+            <w:r>
+              <w:instrText xml:space="preserve"> PAGEREF _Toc700002 \h </w:instrText>
+            </w:r>
+            <w:r>
+              <w:fldChar w:fldCharType="separate"/>
+            </w:r>
+            <w:r>
+              <w:t>3</w:t>
+            </w:r>
+            <w:r>
+              <w:fldChar w:fldCharType="end"/>
+            </w:r>
+          </w:hyperlink>
+        </w:p>
+        <w:p>
+          <w:pPr>
+            <w:tabs>
+              <w:tab w:val="right" w:leader="dot" w:pos="9350"/>
+            </w:tabs>
+            <w:spacing w:after="60"/>
+            <w:ind w:left="0"/>
+          </w:pPr>
+          <w:hyperlink w:anchor="_Toc700003" w:history="1">
+            <w:r>
+              <w:t xml:space="preserve">2. Visión general de la arquitectura</w:t>
+            </w:r>
+            <w:r>
+              <w:tab/>
+            </w:r>
+            <w:r>
+              <w:fldChar w:fldCharType="begin"/>
+            </w:r>
+            <w:r>
+              <w:instrText xml:space="preserve"> PAGEREF _Toc700003 \h </w:instrText>
+            </w:r>
+            <w:r>
+              <w:fldChar w:fldCharType="separate"/>
+            </w:r>
+            <w:r>
+              <w:t>4</w:t>
+            </w:r>
+            <w:r>
+              <w:fldChar w:fldCharType="end"/>
+            </w:r>
+          </w:hyperlink>
+        </w:p>
+        <w:p>
+          <w:pPr>
+            <w:tabs>
+              <w:tab w:val="right" w:leader="dot" w:pos="9350"/>
+            </w:tabs>
+            <w:spacing w:after="60"/>
+            <w:ind w:left="284"/>
+          </w:pPr>
+          <w:hyperlink w:anchor="_Toc700004" w:history="1">
+            <w:r>
+              <w:t xml:space="preserve">2.1 Capas del servidor</w:t>
+            </w:r>
+            <w:r>
+              <w:tab/>
+            </w:r>
+            <w:r>
+              <w:fldChar w:fldCharType="begin"/>
+            </w:r>
+            <w:r>
+              <w:instrText xml:space="preserve"> PAGEREF _Toc700004 \h </w:instrText>
+            </w:r>
+            <w:r>
+              <w:fldChar w:fldCharType="separate"/>
+            </w:r>
+            <w:r>
+              <w:t>4</w:t>
+            </w:r>
+            <w:r>
+              <w:fldChar w:fldCharType="end"/>
+            </w:r>
+          </w:hyperlink>
+        </w:p>
+        <w:p>
+          <w:pPr>
+            <w:tabs>
+              <w:tab w:val="right" w:leader="dot" w:pos="9350"/>
+            </w:tabs>
+            <w:spacing w:after="60"/>
+            <w:ind w:left="0"/>
+          </w:pPr>
+          <w:hyperlink w:anchor="_Toc700005" w:history="1">
+            <w:r>
+              <w:t xml:space="preserve">3. Decisiones arquitectónicas</w:t>
+            </w:r>
+            <w:r>
+              <w:tab/>
+            </w:r>
+            <w:r>
+              <w:fldChar w:fldCharType="begin"/>
+            </w:r>
+            <w:r>
+              <w:instrText xml:space="preserve"> PAGEREF _Toc700005 \h </w:instrText>
+            </w:r>
+            <w:r>
+              <w:fldChar w:fldCharType="separate"/>
+            </w:r>
+            <w:r>
+              <w:t>5</w:t>
+            </w:r>
+            <w:r>
+              <w:fldChar w:fldCharType="end"/>
+            </w:r>
+          </w:hyperlink>
+        </w:p>
+        <w:p>
+          <w:pPr>
+            <w:tabs>
+              <w:tab w:val="right" w:leader="dot" w:pos="9350"/>
+            </w:tabs>
+            <w:spacing w:after="60"/>
+            <w:ind w:left="0"/>
+          </w:pPr>
+          <w:hyperlink w:anchor="_Toc700006" w:history="1">
+            <w:r>
+              <w:t xml:space="preserve">4. Vista de componentes</w:t>
+            </w:r>
+            <w:r>
+              <w:tab/>
+            </w:r>
+            <w:r>
+              <w:fldChar w:fldCharType="begin"/>
+            </w:r>
+            <w:r>
+              <w:instrText xml:space="preserve"> PAGEREF _Toc700006 \h </w:instrText>
+            </w:r>
+            <w:r>
+              <w:fldChar w:fldCharType="separate"/>
+            </w:r>
+            <w:r>
+              <w:t>6</w:t>
+            </w:r>
+            <w:r>
+              <w:fldChar w:fldCharType="end"/>
+            </w:r>
+          </w:hyperlink>
+        </w:p>
+        <w:p>
+          <w:pPr>
+            <w:tabs>
+              <w:tab w:val="right" w:leader="dot" w:pos="9350"/>
+            </w:tabs>
+            <w:spacing w:after="60"/>
+            <w:ind w:left="284"/>
+          </w:pPr>
+          <w:hyperlink w:anchor="_Toc700007" w:history="1">
+            <w:r>
+              <w:t xml:space="preserve">4.1 Aplicaciones Django del servidor</w:t>
+            </w:r>
+            <w:r>
+              <w:tab/>
+            </w:r>
+            <w:r>
+              <w:fldChar w:fldCharType="begin"/>
+            </w:r>
+            <w:r>
+              <w:instrText xml:space="preserve"> PAGEREF _Toc700007 \h </w:instrText>
+            </w:r>
+            <w:r>
+              <w:fldChar w:fldCharType="separate"/>
+            </w:r>
+            <w:r>
+              <w:t>8</w:t>
+            </w:r>
+            <w:r>
+              <w:fldChar w:fldCharType="end"/>
+            </w:r>
+          </w:hyperlink>
+        </w:p>
+        <w:p>
+          <w:pPr>
+            <w:tabs>
+              <w:tab w:val="right" w:leader="dot" w:pos="9350"/>
+            </w:tabs>
+            <w:spacing w:after="60"/>
+            <w:ind w:left="0"/>
+          </w:pPr>
+          <w:hyperlink w:anchor="_Toc700008" w:history="1">
+            <w:r>
+              <w:t xml:space="preserve">5. Vista de despliegue</w:t>
+            </w:r>
+            <w:r>
+              <w:tab/>
+            </w:r>
+            <w:r>
+              <w:fldChar w:fldCharType="begin"/>
+            </w:r>
+            <w:r>
+              <w:instrText xml:space="preserve"> PAGEREF _Toc700008 \h </w:instrText>
+            </w:r>
+            <w:r>
+              <w:fldChar w:fldCharType="separate"/>
+            </w:r>
+            <w:r>
+              <w:t>8</w:t>
+            </w:r>
+            <w:r>
+              <w:fldChar w:fldCharType="end"/>
+            </w:r>
+          </w:hyperlink>
+        </w:p>
+        <w:p>
+          <w:pPr>
+            <w:tabs>
+              <w:tab w:val="right" w:leader="dot" w:pos="9350"/>
+            </w:tabs>
+            <w:spacing w:after="60"/>
+            <w:ind w:left="284"/>
+          </w:pPr>
+          <w:hyperlink w:anchor="_Toc700009" w:history="1">
+            <w:r>
+              <w:t xml:space="preserve">5.1 Integración y despliegue continuo</w:t>
+            </w:r>
+            <w:r>
+              <w:tab/>
+            </w:r>
+            <w:r>
+              <w:fldChar w:fldCharType="begin"/>
+            </w:r>
+            <w:r>
+              <w:instrText xml:space="preserve"> PAGEREF _Toc700009 \h </w:instrText>
+            </w:r>
+            <w:r>
+              <w:fldChar w:fldCharType="separate"/>
+            </w:r>
+            <w:r>
+              <w:t>10</w:t>
+            </w:r>
+            <w:r>
+              <w:fldChar w:fldCharType="end"/>
+            </w:r>
+          </w:hyperlink>
+        </w:p>
+        <w:p>
+          <w:pPr>
+            <w:tabs>
+              <w:tab w:val="right" w:leader="dot" w:pos="9350"/>
+            </w:tabs>
+            <w:spacing w:after="60"/>
+            <w:ind w:left="0"/>
+          </w:pPr>
+          <w:hyperlink w:anchor="_Toc700010" w:history="1">
+            <w:r>
+              <w:t xml:space="preserve">6. Seguridad en la arquitectura</w:t>
+            </w:r>
+            <w:r>
+              <w:tab/>
+            </w:r>
+            <w:r>
+              <w:fldChar w:fldCharType="begin"/>
+            </w:r>
+            <w:r>
+              <w:instrText xml:space="preserve"> PAGEREF _Toc700010 \h </w:instrText>
+            </w:r>
+            <w:r>
+              <w:fldChar w:fldCharType="separate"/>
+            </w:r>
+            <w:r>
+              <w:t>10</w:t>
+            </w:r>
+            <w:r>
+              <w:fldChar w:fldCharType="end"/>
+            </w:r>
+          </w:hyperlink>
+        </w:p>
+        <w:p>
+          <w:pPr>
+            <w:tabs>
+              <w:tab w:val="right" w:leader="dot" w:pos="9350"/>
+            </w:tabs>
+            <w:spacing w:after="60"/>
+            <w:ind w:left="0"/>
+          </w:pPr>
+          <w:hyperlink w:anchor="_Toc700011" w:history="1">
+            <w:r>
+              <w:t xml:space="preserve">7. Integraciones externas</w:t>
+            </w:r>
+            <w:r>
+              <w:tab/>
+            </w:r>
+            <w:r>
+              <w:fldChar w:fldCharType="begin"/>
+            </w:r>
+            <w:r>
+              <w:instrText xml:space="preserve"> PAGEREF _Toc700011 \h </w:instrText>
+            </w:r>
+            <w:r>
+              <w:fldChar w:fldCharType="separate"/>
+            </w:r>
+            <w:r>
+              <w:t>12</w:t>
+            </w:r>
+            <w:r>
+              <w:fldChar w:fldCharType="end"/>
+            </w:r>
+          </w:hyperlink>
+        </w:p>
+        <w:p>
+          <w:pPr>
+            <w:tabs>
+              <w:tab w:val="right" w:leader="dot" w:pos="9350"/>
+            </w:tabs>
+            <w:spacing w:after="60"/>
+            <w:ind w:left="0"/>
+          </w:pPr>
+          <w:hyperlink w:anchor="_Toc700012" w:history="1">
+            <w:r>
+              <w:t xml:space="preserve">8. Diagramas de estados</w:t>
+            </w:r>
+            <w:r>
+              <w:tab/>
+            </w:r>
+            <w:r>
+              <w:fldChar w:fldCharType="begin"/>
+            </w:r>
+            <w:r>
+              <w:instrText xml:space="preserve"> PAGEREF _Toc700012 \h </w:instrText>
+            </w:r>
+            <w:r>
+              <w:fldChar w:fldCharType="separate"/>
+            </w:r>
+            <w:r>
+              <w:t>13</w:t>
+            </w:r>
+            <w:r>
+              <w:fldChar w:fldCharType="end"/>
+            </w:r>
+          </w:hyperlink>
+        </w:p>
+        <w:p>
+          <w:pPr>
+            <w:tabs>
+              <w:tab w:val="right" w:leader="dot" w:pos="9350"/>
+            </w:tabs>
+            <w:spacing w:after="60"/>
+            <w:ind w:left="284"/>
+          </w:pPr>
+          <w:hyperlink w:anchor="_Toc700013" w:history="1">
+            <w:r>
+              <w:t xml:space="preserve">8.1 Solicitud de presupuesto</w:t>
+            </w:r>
+            <w:r>
+              <w:tab/>
+            </w:r>
+            <w:r>
+              <w:fldChar w:fldCharType="begin"/>
+            </w:r>
+            <w:r>
+              <w:instrText xml:space="preserve"> PAGEREF _Toc700013 \h </w:instrText>
+            </w:r>
+            <w:r>
+              <w:fldChar w:fldCharType="separate"/>
+            </w:r>
+            <w:r>
+              <w:t>13</w:t>
+            </w:r>
+            <w:r>
+              <w:fldChar w:fldCharType="end"/>
+            </w:r>
+          </w:hyperlink>
+        </w:p>
+        <w:p>
+          <w:pPr>
+            <w:tabs>
+              <w:tab w:val="right" w:leader="dot" w:pos="9350"/>
+            </w:tabs>
+            <w:spacing w:after="60"/>
+            <w:ind w:left="284"/>
+          </w:pPr>
+          <w:hyperlink w:anchor="_Toc700014" w:history="1">
+            <w:r>
+              <w:t xml:space="preserve">8.2 Cotización</w:t>
+            </w:r>
+            <w:r>
+              <w:tab/>
+            </w:r>
+            <w:r>
+              <w:fldChar w:fldCharType="begin"/>
+            </w:r>
+            <w:r>
+              <w:instrText xml:space="preserve"> PAGEREF _Toc700014 \h </w:instrText>
+            </w:r>
+            <w:r>
+              <w:fldChar w:fldCharType="separate"/>
+            </w:r>
+            <w:r>
+              <w:t>15</w:t>
+            </w:r>
+            <w:r>
+              <w:fldChar w:fldCharType="end"/>
+            </w:r>
+          </w:hyperlink>
+        </w:p>
+        <w:p>
+          <w:pPr>
+            <w:tabs>
+              <w:tab w:val="right" w:leader="dot" w:pos="9350"/>
+            </w:tabs>
+            <w:spacing w:after="60"/>
+            <w:ind w:left="284"/>
+          </w:pPr>
+          <w:hyperlink w:anchor="_Toc700015" w:history="1">
+            <w:r>
+              <w:t xml:space="preserve">8.3 Orden de compra</w:t>
+            </w:r>
+            <w:r>
+              <w:tab/>
+            </w:r>
+            <w:r>
+              <w:fldChar w:fldCharType="begin"/>
+            </w:r>
+            <w:r>
+              <w:instrText xml:space="preserve"> PAGEREF _Toc700015 \h </w:instrText>
+            </w:r>
+            <w:r>
+              <w:fldChar w:fldCharType="separate"/>
+            </w:r>
+            <w:r>
+              <w:t>17</w:t>
+            </w:r>
+            <w:r>
+              <w:fldChar w:fldCharType="end"/>
+            </w:r>
+          </w:hyperlink>
+        </w:p>
+        <w:p>
+          <w:pPr>
+            <w:tabs>
+              <w:tab w:val="right" w:leader="dot" w:pos="9350"/>
+            </w:tabs>
+            <w:spacing w:after="60"/>
+            <w:ind w:left="284"/>
+          </w:pPr>
+          <w:hyperlink w:anchor="_Toc700016" w:history="1">
+            <w:r>
+              <w:t xml:space="preserve">8.4 Orden de trabajo</w:t>
+            </w:r>
+            <w:r>
+              <w:tab/>
+            </w:r>
+            <w:r>
+              <w:fldChar w:fldCharType="begin"/>
+            </w:r>
+            <w:r>
+              <w:instrText xml:space="preserve"> PAGEREF _Toc700016 \h </w:instrText>
+            </w:r>
+            <w:r>
+              <w:fldChar w:fldCharType="separate"/>
+            </w:r>
+            <w:r>
+              <w:t>19</w:t>
+            </w:r>
+            <w:r>
+              <w:fldChar w:fldCharType="end"/>
+            </w:r>
+          </w:hyperlink>
+        </w:p>
+        <w:p>
+          <w:pPr>
+            <w:tabs>
+              <w:tab w:val="right" w:leader="dot" w:pos="9350"/>
+            </w:tabs>
+            <w:spacing w:after="60"/>
+            <w:ind w:left="284"/>
+          </w:pPr>
+          <w:hyperlink w:anchor="_Toc700017" w:history="1">
+            <w:r>
+              <w:t xml:space="preserve">8.5 Documento de cobro y transacción de pago</w:t>
+            </w:r>
+            <w:r>
+              <w:tab/>
+            </w:r>
+            <w:r>
+              <w:fldChar w:fldCharType="begin"/>
+            </w:r>
+            <w:r>
+              <w:instrText xml:space="preserve"> PAGEREF _Toc700017 \h </w:instrText>
+            </w:r>
+            <w:r>
+              <w:fldChar w:fldCharType="separate"/>
+            </w:r>
+            <w:r>
+              <w:t>21</w:t>
+            </w:r>
+            <w:r>
+              <w:fldChar w:fldCharType="end"/>
+            </w:r>
+          </w:hyperlink>
+        </w:p>
+        <w:p>
+          <w:pPr>
+            <w:tabs>
+              <w:tab w:val="right" w:leader="dot" w:pos="9350"/>
+            </w:tabs>
+            <w:spacing w:after="60"/>
+            <w:ind w:left="284"/>
+          </w:pPr>
+          <w:hyperlink w:anchor="_Toc700018" w:history="1">
+            <w:r>
+              <w:t xml:space="preserve">8.6 Cuenta de usuario</w:t>
+            </w:r>
+            <w:r>
+              <w:tab/>
+            </w:r>
+            <w:r>
+              <w:fldChar w:fldCharType="begin"/>
+            </w:r>
+            <w:r>
+              <w:instrText xml:space="preserve"> PAGEREF _Toc700018 \h </w:instrText>
+            </w:r>
+            <w:r>
+              <w:fldChar w:fldCharType="separate"/>
+            </w:r>
+            <w:r>
+              <w:t>23</w:t>
+            </w:r>
+            <w:r>
+              <w:fldChar w:fldCharType="end"/>
+            </w:r>
+          </w:hyperlink>
+        </w:p>
+        <w:p>
+          <w:pPr>
+            <w:tabs>
+              <w:tab w:val="right" w:leader="dot" w:pos="9350"/>
+            </w:tabs>
+            <w:spacing w:after="60"/>
+            <w:ind w:left="0"/>
+          </w:pPr>
+          <w:hyperlink w:anchor="_Toc700019" w:history="1">
+            <w:r>
+              <w:t xml:space="preserve">9. Diagrama de actividad del proceso de un pedido</w:t>
+            </w:r>
+            <w:r>
+              <w:tab/>
+            </w:r>
+            <w:r>
+              <w:fldChar w:fldCharType="begin"/>
+            </w:r>
+            <w:r>
+              <w:instrText xml:space="preserve"> PAGEREF _Toc700019 \h </w:instrText>
+            </w:r>
+            <w:r>
+              <w:fldChar w:fldCharType="separate"/>
+            </w:r>
+            <w:r>
+              <w:t>25</w:t>
+            </w:r>
+            <w:r>
+              <w:fldChar w:fldCharType="end"/>
+            </w:r>
+          </w:hyperlink>
+        </w:p>
+        <w:p>
+          <w:pPr>
+            <w:tabs>
+              <w:tab w:val="right" w:leader="dot" w:pos="9350"/>
+            </w:tabs>
+            <w:spacing w:after="60"/>
+            <w:ind w:left="0"/>
+          </w:pPr>
+          <w:hyperlink w:anchor="_Toc700020" w:history="1">
+            <w:r>
+              <w:t xml:space="preserve">10. Tecnologías y versiones</w:t>
+            </w:r>
+            <w:r>
+              <w:tab/>
+            </w:r>
+            <w:r>
+              <w:fldChar w:fldCharType="begin"/>
+            </w:r>
+            <w:r>
+              <w:instrText xml:space="preserve"> PAGEREF _Toc700020 \h </w:instrText>
+            </w:r>
+            <w:r>
+              <w:fldChar w:fldCharType="separate"/>
+            </w:r>
+            <w:r>
+              <w:t>27</w:t>
+            </w:r>
+            <w:r>
+              <w:fldChar w:fldCharType="end"/>
+            </w:r>
+          </w:hyperlink>
+        </w:p>
+        <w:p>
+          <w:pPr>
+            <w:tabs>
+              <w:tab w:val="right" w:leader="dot" w:pos="9350"/>
+            </w:tabs>
+            <w:spacing w:after="60"/>
+            <w:ind w:left="0"/>
+          </w:pPr>
+          <w:hyperlink w:anchor="_Toc700021" w:history="1">
+            <w:r>
+              <w:t xml:space="preserve">11. Control de versiones del documento</w:t>
+            </w:r>
+            <w:r>
+              <w:tab/>
+            </w:r>
+            <w:r>
+              <w:fldChar w:fldCharType="begin"/>
+            </w:r>
+            <w:r>
+              <w:instrText xml:space="preserve"> PAGEREF _Toc700021 \h </w:instrText>
+            </w:r>
+            <w:r>
+              <w:fldChar w:fldCharType="separate"/>
+            </w:r>
+            <w:r>
+              <w:t>28</w:t>
+            </w:r>
+            <w:r>
+              <w:fldChar w:fldCharType="end"/>
+            </w:r>
+          </w:hyperlink>
         </w:p>
         <w:p>
           <w:r>
@@ -913,6 +1589,8 @@
       <w:pPr>
         <w:pStyle w:val="Heading1"/>
       </w:pPr>
+      <w:bookmarkStart w:id="880002" w:name="_Toc700002"/>
+      <w:bookmarkEnd w:id="880002"/>
       <w:r>
         <w:t xml:space="preserve">1. Propósito y alcance</w:t>
       </w:r>
@@ -940,6 +1618,8 @@
         <w:pStyle w:val="Heading1"/>
         <w:pageBreakBefore/>
       </w:pPr>
+      <w:bookmarkStart w:id="880003" w:name="_Toc700003"/>
+      <w:bookmarkEnd w:id="880003"/>
       <w:r>
         <w:t xml:space="preserve">2. Visión general de la arquitectura</w:t>
       </w:r>
@@ -1517,7 +2197,7 @@
                 <w:sz w:val="18"/>
                 <w:szCs w:val="18"/>
               </w:rPr>
-              <w:t xml:space="preserve">Sistemas externos autorizados y el propio portal web</w:t>
+              <w:t xml:space="preserve">Sistemas externos autorizados (distribuidores y proveedores) y el propio portal web</w:t>
             </w:r>
           </w:p>
         </w:tc>
@@ -1601,13 +2281,15 @@
         <w:jc w:val="both"/>
       </w:pPr>
       <w:r>
-        <w:t xml:space="preserve">La API pública (/api/publica/v1/) se ejecuta también en ese proceso, pero separada de la API interna: no usa usuarios ni tokens JWT, sino una clave de API por consumidor, y sólo expone dos servicios de consulta, el seguimiento de pedidos y el cotizador.</w:t>
+        <w:t xml:space="preserve">La API pública (/api/publica/v1/) se ejecuta también en ese proceso, pero separada de la API interna: no usa usuarios ni tokens JWT, sino una clave de API por consumidor, y sólo expone tres servicios de consulta: el seguimiento de pedidos, el cotizador y la disponibilidad de materiales para los proveedores.</w:t>
       </w:r>
     </w:p>
     <w:p>
       <w:pPr>
         <w:pStyle w:val="Heading2"/>
       </w:pPr>
+      <w:bookmarkStart w:id="880004" w:name="_Toc700004"/>
+      <w:bookmarkEnd w:id="880004"/>
       <w:r>
         <w:t xml:space="preserve">2.1 Capas del servidor</w:t>
       </w:r>
@@ -2195,6 +2877,8 @@
         <w:pStyle w:val="Heading1"/>
         <w:pageBreakBefore/>
       </w:pPr>
+      <w:bookmarkStart w:id="880005" w:name="_Toc700005"/>
+      <w:bookmarkEnd w:id="880005"/>
       <w:r>
         <w:t xml:space="preserve">3. Decisiones arquitectónicas</w:t>
       </w:r>
@@ -3334,6 +4018,8 @@
         <w:pStyle w:val="Heading1"/>
         <w:pageBreakBefore/>
       </w:pPr>
+      <w:bookmarkStart w:id="880006" w:name="_Toc700006"/>
+      <w:bookmarkEnd w:id="880006"/>
       <w:r>
         <w:t xml:space="preserve">4. Vista de componentes</w:t>
       </w:r>
@@ -3368,7 +4054,7 @@
       <w:r>
         <w:drawing>
           <wp:inline distT="0" distB="0" distL="0" distR="0">
-            <wp:extent cx="6382393" cy="5391149"/>
+            <wp:extent cx="6382393" cy="5233640"/>
             <wp:effectExtent t="0" r="0" b="0" l="0"/>
             <wp:docPr id="1" name="Figura 1. Diagrama de componentes de SITRAFO." descr="Figura 1. Diagrama de componentes de SITRAFO." title="Figura 1. Diagrama de componentes de SITRAFO."/>
             <wp:cNvGraphicFramePr>
@@ -3393,7 +4079,7 @@
                   <pic:spPr bwMode="auto">
                     <a:xfrm>
                       <a:off x="0" y="0"/>
-                      <a:ext cx="6382393" cy="5391149"/>
+                      <a:ext cx="6382393" cy="5233640"/>
                     </a:xfrm>
                     <a:prstGeom prst="rect">
                       <a:avLst/>
@@ -3438,6 +4124,8 @@
       <w:pPr>
         <w:pStyle w:val="Heading2"/>
       </w:pPr>
+      <w:bookmarkStart w:id="880007" w:name="_Toc700007"/>
+      <w:bookmarkEnd w:id="880007"/>
       <w:r>
         <w:t xml:space="preserve">4.1 Aplicaciones Django del servidor</w:t>
       </w:r>
@@ -4274,7 +4962,7 @@
                 <w:sz w:val="18"/>
                 <w:szCs w:val="18"/>
               </w:rPr>
-              <w:t xml:space="preserve">API pública para terceros: seguimiento de pedidos y cotizador, clave de API con servicios asignados, límite por consumidor, registro de uso y documentación Swagger. No agrega tablas.</w:t>
+              <w:t xml:space="preserve">API pública para terceros: seguimiento de pedidos, cotizador y disponibilidad de materiales, clave de API con servicios asignados, límite por consumidor, registro de uso y documentación Swagger. No agrega tablas.</w:t>
             </w:r>
           </w:p>
         </w:tc>
@@ -4352,6 +5040,8 @@
       <w:pPr>
         <w:pStyle w:val="Heading1"/>
       </w:pPr>
+      <w:bookmarkStart w:id="880008" w:name="_Toc700008"/>
+      <w:bookmarkEnd w:id="880008"/>
       <w:r>
         <w:t xml:space="preserve">5. Vista de despliegue</w:t>
       </w:r>
@@ -5034,6 +5724,8 @@
       <w:pPr>
         <w:pStyle w:val="Heading2"/>
       </w:pPr>
+      <w:bookmarkStart w:id="880009" w:name="_Toc700009"/>
+      <w:bookmarkEnd w:id="880009"/>
       <w:r>
         <w:t xml:space="preserve">5.1 Integración y despliegue continuo</w:t>
       </w:r>
@@ -5107,6 +5799,8 @@
       <w:pPr>
         <w:pStyle w:val="Heading1"/>
       </w:pPr>
+      <w:bookmarkStart w:id="880010" w:name="_Toc700010"/>
+      <w:bookmarkEnd w:id="880010"/>
       <w:r>
         <w:t xml:space="preserve">6. Seguridad en la arquitectura</w:t>
       </w:r>
@@ -5925,7 +6619,7 @@
                 <w:sz w:val="18"/>
                 <w:szCs w:val="18"/>
               </w:rPr>
-              <w:t xml:space="preserve">Clave de API por consumidor en el encabezado X-API-Key, con servicios asignados y límite de 60 consultas por minuto. Código de seguimiento con HMAC-SHA256, comparado en tiempo constante, y el mismo 404 ante un número o un código incorrectos. Respuestas sin montos, costos, márgenes ni datos personales. Cada consulta queda en log_integracion, sin el código.</w:t>
+              <w:t xml:space="preserve">Clave de API por consumidor en el encabezado X-API-Key, con servicios asignados (las claves del portal no acceden al inventario) y límite de 60 consultas por minuto. Código de seguimiento con HMAC-SHA256, comparado en tiempo constante, y el mismo 404 ante un número o un código incorrectos. Respuestas sin montos, costos, márgenes ni datos personales. Cada consulta queda en log_integracion, sin el código.</w:t>
             </w:r>
           </w:p>
         </w:tc>
@@ -6246,6 +6940,8 @@
         <w:pStyle w:val="Heading1"/>
         <w:pageBreakBefore/>
       </w:pPr>
+      <w:bookmarkStart w:id="880011" w:name="_Toc700011"/>
+      <w:bookmarkEnd w:id="880011"/>
       <w:r>
         <w:t xml:space="preserve">7. Integraciones externas</w:t>
       </w:r>
@@ -6849,7 +7545,7 @@
         <w:jc w:val="both"/>
       </w:pPr>
       <w:r>
-        <w:t xml:space="preserve">Además de consumir estos cinco servicios, SITRAFO expone sus propias APIs públicas para terceros en /api/publica/v1/: el seguimiento de pedidos y el cotizador (diagramas SEC-10 y SEC-11 del documento SEC-01). Están documentadas en /api/publica/v1/docs/ y sus consultas quedan en el mismo registro de integraciones, como api_seguimiento y api_cotizador.</w:t>
+        <w:t xml:space="preserve">Además de consumir estos cinco servicios, SITRAFO expone sus propias APIs públicas para terceros en /api/publica/v1/: el seguimiento de pedidos, el cotizador y la disponibilidad de materiales (diagramas SEC-10 a SEC-12 del documento SEC-01). Están documentadas en /api/publica/v1/docs/ y sus consultas quedan en el mismo registro de integraciones, como api_seguimiento, api_cotizador y api_materiales.</w:t>
       </w:r>
     </w:p>
     <w:p>
@@ -6857,6 +7553,8 @@
         <w:pStyle w:val="Heading1"/>
         <w:pageBreakBefore/>
       </w:pPr>
+      <w:bookmarkStart w:id="880012" w:name="_Toc700012"/>
+      <w:bookmarkEnd w:id="880012"/>
       <w:r>
         <w:t xml:space="preserve">8. Diagramas de estados</w:t>
       </w:r>
@@ -6874,6 +7572,8 @@
       <w:pPr>
         <w:pStyle w:val="Heading2"/>
       </w:pPr>
+      <w:bookmarkStart w:id="880013" w:name="_Toc700013"/>
+      <w:bookmarkEnd w:id="880013"/>
       <w:r>
         <w:t xml:space="preserve">8.1 Solicitud de presupuesto</w:t>
       </w:r>
@@ -6978,6 +7678,8 @@
       <w:pPr>
         <w:pStyle w:val="Heading2"/>
       </w:pPr>
+      <w:bookmarkStart w:id="880014" w:name="_Toc700014"/>
+      <w:bookmarkEnd w:id="880014"/>
       <w:r>
         <w:t xml:space="preserve">8.2 Cotización</w:t>
       </w:r>
@@ -7082,6 +7784,8 @@
       <w:pPr>
         <w:pStyle w:val="Heading2"/>
       </w:pPr>
+      <w:bookmarkStart w:id="880015" w:name="_Toc700015"/>
+      <w:bookmarkEnd w:id="880015"/>
       <w:r>
         <w:t xml:space="preserve">8.3 Orden de compra</w:t>
       </w:r>
@@ -7186,6 +7890,8 @@
       <w:pPr>
         <w:pStyle w:val="Heading2"/>
       </w:pPr>
+      <w:bookmarkStart w:id="880016" w:name="_Toc700016"/>
+      <w:bookmarkEnd w:id="880016"/>
       <w:r>
         <w:t xml:space="preserve">8.4 Orden de trabajo</w:t>
       </w:r>
@@ -7290,6 +7996,8 @@
       <w:pPr>
         <w:pStyle w:val="Heading2"/>
       </w:pPr>
+      <w:bookmarkStart w:id="880017" w:name="_Toc700017"/>
+      <w:bookmarkEnd w:id="880017"/>
       <w:r>
         <w:t xml:space="preserve">8.5 Documento de cobro y transacción de pago</w:t>
       </w:r>
@@ -7394,6 +8102,8 @@
       <w:pPr>
         <w:pStyle w:val="Heading2"/>
       </w:pPr>
+      <w:bookmarkStart w:id="880018" w:name="_Toc700018"/>
+      <w:bookmarkEnd w:id="880018"/>
       <w:r>
         <w:t xml:space="preserve">8.6 Cuenta de usuario</w:t>
       </w:r>
@@ -7498,6 +8208,8 @@
       <w:pPr>
         <w:pStyle w:val="Heading1"/>
       </w:pPr>
+      <w:bookmarkStart w:id="880019" w:name="_Toc700019"/>
+      <w:bookmarkEnd w:id="880019"/>
       <w:r>
         <w:t xml:space="preserve">9. Diagrama de actividad del proceso de un pedido</w:t>
       </w:r>
@@ -7611,6 +8323,8 @@
       <w:pPr>
         <w:pStyle w:val="Heading1"/>
       </w:pPr>
+      <w:bookmarkStart w:id="880020" w:name="_Toc700020"/>
+      <w:bookmarkEnd w:id="880020"/>
       <w:r>
         <w:t xml:space="preserve">10. Tecnologías y versiones</w:t>
       </w:r>
@@ -8842,6 +9556,8 @@
         <w:pStyle w:val="Heading1"/>
         <w:pageBreakBefore/>
       </w:pPr>
+      <w:bookmarkStart w:id="880021" w:name="_Toc700021"/>
+      <w:bookmarkEnd w:id="880021"/>
       <w:r>
         <w:t xml:space="preserve">11. Control de versiones del documento</w:t>
       </w:r>
@@ -9348,6 +10064,127 @@
                 <w:szCs w:val="20"/>
               </w:rPr>
               <w:t xml:space="preserve">API pública propia: componente en COMP-01, aplicación apps.api_publica, decisiones arquitectónicas (clave de API, código de seguimiento con HMAC y Swagger), seguridad e integraciones.</w:t>
+            </w:r>
+          </w:p>
+        </w:tc>
+      </w:tr>
+      <w:tr>
+        <w:trPr>
+          <w:cantSplit/>
+        </w:trPr>
+        <w:tc>
+          <w:tcPr>
+            <w:tcW w:type="dxa" w:w="1000"/>
+            <w:tcBorders>
+              <w:top w:val="single" w:color="8496B0" w:sz="4"/>
+              <w:left w:val="single" w:color="8496B0" w:sz="4"/>
+              <w:bottom w:val="single" w:color="8496B0" w:sz="4"/>
+              <w:right w:val="single" w:color="8496B0" w:sz="4"/>
+            </w:tcBorders>
+            <w:tcMar>
+              <w:top w:type="dxa" w:w="50"/>
+              <w:left w:type="dxa" w:w="90"/>
+              <w:bottom w:type="dxa" w:w="50"/>
+              <w:right w:type="dxa" w:w="90"/>
+            </w:tcMar>
+          </w:tcPr>
+          <w:p>
+            <w:r>
+              <w:rPr>
+                <w:rFonts w:ascii="Calibri" w:cs="Calibri" w:eastAsia="Calibri" w:hAnsi="Calibri"/>
+                <w:b w:val="false"/>
+                <w:bCs w:val="false"/>
+                <w:sz w:val="20"/>
+                <w:szCs w:val="20"/>
+              </w:rPr>
+              <w:t xml:space="preserve">1.3</w:t>
+            </w:r>
+          </w:p>
+        </w:tc>
+        <w:tc>
+          <w:tcPr>
+            <w:tcW w:type="dxa" w:w="1500"/>
+            <w:tcBorders>
+              <w:top w:val="single" w:color="8496B0" w:sz="4"/>
+              <w:left w:val="single" w:color="8496B0" w:sz="4"/>
+              <w:bottom w:val="single" w:color="8496B0" w:sz="4"/>
+              <w:right w:val="single" w:color="8496B0" w:sz="4"/>
+            </w:tcBorders>
+            <w:tcMar>
+              <w:top w:type="dxa" w:w="50"/>
+              <w:left w:type="dxa" w:w="90"/>
+              <w:bottom w:type="dxa" w:w="50"/>
+              <w:right w:type="dxa" w:w="90"/>
+            </w:tcMar>
+          </w:tcPr>
+          <w:p>
+            <w:r>
+              <w:rPr>
+                <w:rFonts w:ascii="Calibri" w:cs="Calibri" w:eastAsia="Calibri" w:hAnsi="Calibri"/>
+                <w:b w:val="false"/>
+                <w:bCs w:val="false"/>
+                <w:sz w:val="20"/>
+                <w:szCs w:val="20"/>
+              </w:rPr>
+              <w:t xml:space="preserve">22-10-2026</w:t>
+            </w:r>
+          </w:p>
+        </w:tc>
+        <w:tc>
+          <w:tcPr>
+            <w:tcW w:type="dxa" w:w="2300"/>
+            <w:tcBorders>
+              <w:top w:val="single" w:color="8496B0" w:sz="4"/>
+              <w:left w:val="single" w:color="8496B0" w:sz="4"/>
+              <w:bottom w:val="single" w:color="8496B0" w:sz="4"/>
+              <w:right w:val="single" w:color="8496B0" w:sz="4"/>
+            </w:tcBorders>
+            <w:tcMar>
+              <w:top w:type="dxa" w:w="50"/>
+              <w:left w:type="dxa" w:w="90"/>
+              <w:bottom w:type="dxa" w:w="50"/>
+              <w:right w:type="dxa" w:w="90"/>
+            </w:tcMar>
+          </w:tcPr>
+          <w:p>
+            <w:r>
+              <w:rPr>
+                <w:rFonts w:ascii="Calibri" w:cs="Calibri" w:eastAsia="Calibri" w:hAnsi="Calibri"/>
+                <w:b w:val="false"/>
+                <w:bCs w:val="false"/>
+                <w:sz w:val="20"/>
+                <w:szCs w:val="20"/>
+              </w:rPr>
+              <w:t xml:space="preserve">Benjamín Delgado Bravo</w:t>
+            </w:r>
+          </w:p>
+        </w:tc>
+        <w:tc>
+          <w:tcPr>
+            <w:tcW w:type="dxa" w:w="4560"/>
+            <w:tcBorders>
+              <w:top w:val="single" w:color="8496B0" w:sz="4"/>
+              <w:left w:val="single" w:color="8496B0" w:sz="4"/>
+              <w:bottom w:val="single" w:color="8496B0" w:sz="4"/>
+              <w:right w:val="single" w:color="8496B0" w:sz="4"/>
+            </w:tcBorders>
+            <w:tcMar>
+              <w:top w:type="dxa" w:w="50"/>
+              <w:left w:type="dxa" w:w="90"/>
+              <w:bottom w:type="dxa" w:w="50"/>
+              <w:right w:type="dxa" w:w="90"/>
+            </w:tcMar>
+          </w:tcPr>
+          <w:p>
+            <w:r>
+              <w:rPr>
+                <w:rFonts w:ascii="Calibri" w:cs="Calibri" w:eastAsia="Calibri" w:hAnsi="Calibri"/>
+                <w:b w:val="false"/>
+                <w:bCs w:val="false"/>
+                <w:sz w:val="20"/>
+                <w:szCs w:val="20"/>
+              </w:rPr>
+              <w:t xml:space="preserve">Tercera API pública (disponibilidad de materiales, RF-INV-09): COMP-01 actualizado, apps.api_publica, visión general, seguridad e integraciones.</w:t>
             </w:r>
           </w:p>
         </w:tc>
@@ -9975,7 +10812,7 @@
         <w:sz w:val="16"/>
         <w:szCs w:val="16"/>
       </w:rPr>
-      <w:t xml:space="preserve">SITRAFO · ARQ-01 Arquitectura y Diseño del Comportamiento · v1.2</w:t>
+      <w:t xml:space="preserve">SITRAFO · ARQ-01 Arquitectura y Diseño del Comportamiento · v1.3</w:t>
     </w:r>
   </w:p>
 </w:hdr>
@@ -9995,7 +10832,7 @@
         <w:sz w:val="16"/>
         <w:szCs w:val="16"/>
       </w:rPr>
-      <w:t xml:space="preserve">SITRAFO · ARQ-01 Arquitectura y Diseño del Comportamiento · v1.2</w:t>
+      <w:t xml:space="preserve">SITRAFO · ARQ-01 Arquitectura y Diseño del Comportamiento · v1.3</w:t>
     </w:r>
   </w:p>
 </w:hdr>
@@ -10015,7 +10852,7 @@
         <w:sz w:val="16"/>
         <w:szCs w:val="16"/>
       </w:rPr>
-      <w:t xml:space="preserve">SITRAFO · ARQ-01 Arquitectura y Diseño del Comportamiento · v1.2</w:t>
+      <w:t xml:space="preserve">SITRAFO · ARQ-01 Arquitectura y Diseño del Comportamiento · v1.3</w:t>
     </w:r>
   </w:p>
 </w:hdr>
@@ -10035,7 +10872,7 @@
         <w:sz w:val="16"/>
         <w:szCs w:val="16"/>
       </w:rPr>
-      <w:t xml:space="preserve">SITRAFO · ARQ-01 Arquitectura y Diseño del Comportamiento · v1.2</w:t>
+      <w:t xml:space="preserve">SITRAFO · ARQ-01 Arquitectura y Diseño del Comportamiento · v1.3</w:t>
     </w:r>
   </w:p>
 </w:hdr>
@@ -10055,7 +10892,7 @@
         <w:sz w:val="16"/>
         <w:szCs w:val="16"/>
       </w:rPr>
-      <w:t xml:space="preserve">SITRAFO · ARQ-01 Arquitectura y Diseño del Comportamiento · v1.2</w:t>
+      <w:t xml:space="preserve">SITRAFO · ARQ-01 Arquitectura y Diseño del Comportamiento · v1.3</w:t>
     </w:r>
   </w:p>
 </w:hdr>
@@ -10075,7 +10912,7 @@
         <w:sz w:val="16"/>
         <w:szCs w:val="16"/>
       </w:rPr>
-      <w:t xml:space="preserve">SITRAFO · ARQ-01 Arquitectura y Diseño del Comportamiento · v1.2</w:t>
+      <w:t xml:space="preserve">SITRAFO · ARQ-01 Arquitectura y Diseño del Comportamiento · v1.3</w:t>
     </w:r>
   </w:p>
 </w:hdr>
@@ -10095,7 +10932,7 @@
         <w:sz w:val="16"/>
         <w:szCs w:val="16"/>
       </w:rPr>
-      <w:t xml:space="preserve">SITRAFO · ARQ-01 Arquitectura y Diseño del Comportamiento · v1.2</w:t>
+      <w:t xml:space="preserve">SITRAFO · ARQ-01 Arquitectura y Diseño del Comportamiento · v1.3</w:t>
     </w:r>
   </w:p>
 </w:hdr>
@@ -10115,7 +10952,7 @@
         <w:sz w:val="16"/>
         <w:szCs w:val="16"/>
       </w:rPr>
-      <w:t xml:space="preserve">SITRAFO · ARQ-01 Arquitectura y Diseño del Comportamiento · v1.2</w:t>
+      <w:t xml:space="preserve">SITRAFO · ARQ-01 Arquitectura y Diseño del Comportamiento · v1.3</w:t>
     </w:r>
   </w:p>
 </w:hdr>
@@ -10135,7 +10972,7 @@
         <w:sz w:val="16"/>
         <w:szCs w:val="16"/>
       </w:rPr>
-      <w:t xml:space="preserve">SITRAFO · ARQ-01 Arquitectura y Diseño del Comportamiento · v1.2</w:t>
+      <w:t xml:space="preserve">SITRAFO · ARQ-01 Arquitectura y Diseño del Comportamiento · v1.3</w:t>
     </w:r>
   </w:p>
 </w:hdr>
@@ -10155,7 +10992,7 @@
         <w:sz w:val="16"/>
         <w:szCs w:val="16"/>
       </w:rPr>
-      <w:t xml:space="preserve">SITRAFO · ARQ-01 Arquitectura y Diseño del Comportamiento · v1.2</w:t>
+      <w:t xml:space="preserve">SITRAFO · ARQ-01 Arquitectura y Diseño del Comportamiento · v1.3</w:t>
     </w:r>
   </w:p>
 </w:hdr>
@@ -10175,7 +11012,7 @@
         <w:sz w:val="16"/>
         <w:szCs w:val="16"/>
       </w:rPr>
-      <w:t xml:space="preserve">SITRAFO · ARQ-01 Arquitectura y Diseño del Comportamiento · v1.2</w:t>
+      <w:t xml:space="preserve">SITRAFO · ARQ-01 Arquitectura y Diseño del Comportamiento · v1.3</w:t>
     </w:r>
   </w:p>
 </w:hdr>
@@ -10195,7 +11032,7 @@
         <w:sz w:val="16"/>
         <w:szCs w:val="16"/>
       </w:rPr>
-      <w:t xml:space="preserve">SITRAFO · ARQ-01 Arquitectura y Diseño del Comportamiento · v1.2</w:t>
+      <w:t xml:space="preserve">SITRAFO · ARQ-01 Arquitectura y Diseño del Comportamiento · v1.3</w:t>
     </w:r>
   </w:p>
 </w:hdr>
@@ -10215,7 +11052,7 @@
         <w:sz w:val="16"/>
         <w:szCs w:val="16"/>
       </w:rPr>
-      <w:t xml:space="preserve">SITRAFO · ARQ-01 Arquitectura y Diseño del Comportamiento · v1.2</w:t>
+      <w:t xml:space="preserve">SITRAFO · ARQ-01 Arquitectura y Diseño del Comportamiento · v1.3</w:t>
     </w:r>
   </w:p>
 </w:hdr>
@@ -10235,7 +11072,7 @@
         <w:sz w:val="16"/>
         <w:szCs w:val="16"/>
       </w:rPr>
-      <w:t xml:space="preserve">SITRAFO · ARQ-01 Arquitectura y Diseño del Comportamiento · v1.2</w:t>
+      <w:t xml:space="preserve">SITRAFO · ARQ-01 Arquitectura y Diseño del Comportamiento · v1.3</w:t>
     </w:r>
   </w:p>
 </w:hdr>
@@ -10255,7 +11092,7 @@
         <w:sz w:val="16"/>
         <w:szCs w:val="16"/>
       </w:rPr>
-      <w:t xml:space="preserve">SITRAFO · ARQ-01 Arquitectura y Diseño del Comportamiento · v1.2</w:t>
+      <w:t xml:space="preserve">SITRAFO · ARQ-01 Arquitectura y Diseño del Comportamiento · v1.3</w:t>
     </w:r>
   </w:p>
 </w:hdr>
@@ -10275,7 +11112,7 @@
         <w:sz w:val="16"/>
         <w:szCs w:val="16"/>
       </w:rPr>
-      <w:t xml:space="preserve">SITRAFO · ARQ-01 Arquitectura y Diseño del Comportamiento · v1.2</w:t>
+      <w:t xml:space="preserve">SITRAFO · ARQ-01 Arquitectura y Diseño del Comportamiento · v1.3</w:t>
     </w:r>
   </w:p>
 </w:hdr>
@@ -10295,7 +11132,7 @@
         <w:sz w:val="16"/>
         <w:szCs w:val="16"/>
       </w:rPr>
-      <w:t xml:space="preserve">SITRAFO · ARQ-01 Arquitectura y Diseño del Comportamiento · v1.2</w:t>
+      <w:t xml:space="preserve">SITRAFO · ARQ-01 Arquitectura y Diseño del Comportamiento · v1.3</w:t>
     </w:r>
   </w:p>
 </w:hdr>
@@ -10315,7 +11152,7 @@
         <w:sz w:val="16"/>
         <w:szCs w:val="16"/>
       </w:rPr>
-      <w:t xml:space="preserve">SITRAFO · ARQ-01 Arquitectura y Diseño del Comportamiento · v1.2</w:t>
+      <w:t xml:space="preserve">SITRAFO · ARQ-01 Arquitectura y Diseño del Comportamiento · v1.3</w:t>
     </w:r>
   </w:p>
 </w:hdr>
@@ -10335,7 +11172,7 @@
         <w:sz w:val="16"/>
         <w:szCs w:val="16"/>
       </w:rPr>
-      <w:t xml:space="preserve">SITRAFO · ARQ-01 Arquitectura y Diseño del Comportamiento · v1.2</w:t>
+      <w:t xml:space="preserve">SITRAFO · ARQ-01 Arquitectura y Diseño del Comportamiento · v1.3</w:t>
     </w:r>
   </w:p>
 </w:hdr>

</xml_diff>